<commit_message>
docs: Revisar e ajustar a definição de atores no sistema, garantindo que todos os papéis estejam corretos, completos e bem descritos.
</commit_message>
<xml_diff>
--- a/documentation/template/Sprint Documentation atualizada.docx
+++ b/documentation/template/Sprint Documentation atualizada.docx
@@ -1,6 +1,6 @@
 
 <file path=word/document.xml><?xml version="1.0" encoding="utf-8"?>
-<w:document xmlns:wpc="http://schemas.microsoft.com/office/word/2010/wordprocessingCanvas" xmlns:cx="http://schemas.microsoft.com/office/drawing/2014/chartex" xmlns:cx1="http://schemas.microsoft.com/office/drawing/2015/9/8/chartex" xmlns:cx2="http://schemas.microsoft.com/office/drawing/2015/10/21/chartex" xmlns:cx3="http://schemas.microsoft.com/office/drawing/2016/5/9/chartex" xmlns:cx4="http://schemas.microsoft.com/office/drawing/2016/5/10/chartex" xmlns:cx5="http://schemas.microsoft.com/office/drawing/2016/5/11/chartex" xmlns:cx6="http://schemas.microsoft.com/office/drawing/2016/5/12/chartex" xmlns:cx7="http://schemas.microsoft.com/office/drawing/2016/5/13/chartex" xmlns:cx8="http://schemas.microsoft.com/office/drawing/2016/5/14/chartex" xmlns:mc="http://schemas.openxmlformats.org/markup-compatibility/2006" xmlns:aink="http://schemas.microsoft.com/office/drawing/2016/ink" xmlns:am3d="http://schemas.microsoft.com/office/drawing/2017/model3d" xmlns:o="urn:schemas-microsoft-com:office:office" xmlns:oel="http://schemas.microsoft.com/office/2019/extlst" xmlns:r="http://schemas.openxmlformats.org/officeDocument/2006/relationships" xmlns:m="http://schemas.openxmlformats.org/officeDocument/2006/math" xmlns:v="urn:schemas-microsoft-com:vml" xmlns:wp14="http://schemas.microsoft.com/office/word/2010/wordprocessingDrawing" xmlns:wp="http://schemas.openxmlformats.org/drawingml/2006/wordprocessingDrawing" xmlns:w10="urn:schemas-microsoft-com:office:word" xmlns:w="http://schemas.openxmlformats.org/wordprocessingml/2006/main" xmlns:w14="http://schemas.microsoft.com/office/word/2010/wordml" xmlns:w15="http://schemas.microsoft.com/office/word/2012/wordml" xmlns:w16cex="http://schemas.microsoft.com/office/word/2018/wordml/cex" xmlns:w16cid="http://schemas.microsoft.com/office/word/2016/wordml/cid" xmlns:w16="http://schemas.microsoft.com/office/word/2018/wordml" xmlns:w16du="http://schemas.microsoft.com/office/word/2023/wordml/word16du" xmlns:w16sdtdh="http://schemas.microsoft.com/office/word/2020/wordml/sdtdatahash" xmlns:w16sdtfl="http://schemas.microsoft.com/office/word/2024/wordml/sdtformatlock" xmlns:w16se="http://schemas.microsoft.com/office/word/2015/wordml/symex" xmlns:wpg="http://schemas.microsoft.com/office/word/2010/wordprocessingGroup" xmlns:wpi="http://schemas.microsoft.com/office/word/2010/wordprocessingInk" xmlns:wne="http://schemas.microsoft.com/office/word/2006/wordml" xmlns:wps="http://schemas.microsoft.com/office/word/2010/wordprocessingShape" mc:Ignorable="w14 w15 w16se w16cid w16 w16cex w16sdtdh w16sdtfl w16du wp14">
+<w:document xmlns:wpc="http://schemas.microsoft.com/office/word/2010/wordprocessingCanvas" xmlns:cx="http://schemas.microsoft.com/office/drawing/2014/chartex" xmlns:cx1="http://schemas.microsoft.com/office/drawing/2015/9/8/chartex" xmlns:cx2="http://schemas.microsoft.com/office/drawing/2015/10/21/chartex" xmlns:cx3="http://schemas.microsoft.com/office/drawing/2016/5/9/chartex" xmlns:cx4="http://schemas.microsoft.com/office/drawing/2016/5/10/chartex" xmlns:cx5="http://schemas.microsoft.com/office/drawing/2016/5/11/chartex" xmlns:cx6="http://schemas.microsoft.com/office/drawing/2016/5/12/chartex" xmlns:cx7="http://schemas.microsoft.com/office/drawing/2016/5/13/chartex" xmlns:cx8="http://schemas.microsoft.com/office/drawing/2016/5/14/chartex" xmlns:mc="http://schemas.openxmlformats.org/markup-compatibility/2006" xmlns:aink="http://schemas.microsoft.com/office/drawing/2016/ink" xmlns:am3d="http://schemas.microsoft.com/office/drawing/2017/model3d" xmlns:o="urn:schemas-microsoft-com:office:office" xmlns:r="http://schemas.openxmlformats.org/officeDocument/2006/relationships" xmlns:m="http://schemas.openxmlformats.org/officeDocument/2006/math" xmlns:v="urn:schemas-microsoft-com:vml" xmlns:wp14="http://schemas.microsoft.com/office/word/2010/wordprocessingDrawing" xmlns:wp="http://schemas.openxmlformats.org/drawingml/2006/wordprocessingDrawing" xmlns:w10="urn:schemas-microsoft-com:office:word" xmlns:w="http://schemas.openxmlformats.org/wordprocessingml/2006/main" xmlns:w14="http://schemas.microsoft.com/office/word/2010/wordml" xmlns:w15="http://schemas.microsoft.com/office/word/2012/wordml" xmlns:w16cid="http://schemas.microsoft.com/office/word/2016/wordml/cid" xmlns:w16se="http://schemas.microsoft.com/office/word/2015/wordml/symex" xmlns:wpg="http://schemas.microsoft.com/office/word/2010/wordprocessingGroup" xmlns:wpi="http://schemas.microsoft.com/office/word/2010/wordprocessingInk" xmlns:wne="http://schemas.microsoft.com/office/word/2006/wordml" xmlns:wps="http://schemas.microsoft.com/office/word/2010/wordprocessingShape" mc:Ignorable="w14 w15 w16se w16cid wp14">
   <w:body>
     <w:p>
       <w:pPr>
@@ -31,7 +31,7 @@
                     </pic:cNvPicPr>
                   </pic:nvPicPr>
                   <pic:blipFill>
-                    <a:blip r:embed="rId6" cstate="print">
+                    <a:blip r:embed="rId7" cstate="print">
                       <a:extLst>
                         <a:ext uri="{28A0092B-C50C-407E-A947-70E740481C1C}">
                           <a14:useLocalDpi xmlns:a14="http://schemas.microsoft.com/office/drawing/2010/main" val="0"/>
@@ -140,6 +140,13 @@
               </w:rPr>
               <w:t>Sprint #</w:t>
             </w:r>
+            <w:r>
+              <w:rPr>
+                <w:b/>
+                <w:bCs/>
+              </w:rPr>
+              <w:t xml:space="preserve"> 1</w:t>
+            </w:r>
           </w:p>
         </w:tc>
         <w:tc>
@@ -159,6 +166,13 @@
                 <w:bCs/>
               </w:rPr>
               <w:t>Start Date:</w:t>
+            </w:r>
+            <w:r>
+              <w:rPr>
+                <w:b/>
+                <w:bCs/>
+              </w:rPr>
+              <w:t xml:space="preserve"> 24/09/2025</w:t>
             </w:r>
           </w:p>
         </w:tc>
@@ -181,6 +195,13 @@
               </w:rPr>
               <w:t>Final Date:</w:t>
             </w:r>
+            <w:r>
+              <w:rPr>
+                <w:b/>
+                <w:bCs/>
+              </w:rPr>
+              <w:t xml:space="preserve"> 29/09/2025</w:t>
+            </w:r>
           </w:p>
         </w:tc>
       </w:tr>
@@ -196,15 +217,20 @@
                 <w:bCs/>
               </w:rPr>
             </w:pPr>
-            <w:proofErr w:type="spellStart"/>
-            <w:r>
-              <w:rPr>
-                <w:b/>
-                <w:bCs/>
-              </w:rPr>
-              <w:t>Projetc</w:t>
-            </w:r>
-            <w:proofErr w:type="spellEnd"/>
+            <w:r>
+              <w:rPr>
+                <w:b/>
+                <w:bCs/>
+              </w:rPr>
+              <w:t>Proje</w:t>
+            </w:r>
+            <w:r>
+              <w:rPr>
+                <w:b/>
+                <w:bCs/>
+              </w:rPr>
+              <w:t>ct</w:t>
+            </w:r>
             <w:r>
               <w:rPr>
                 <w:b/>
@@ -242,6 +268,22 @@
                 <w:bCs/>
               </w:rPr>
             </w:pPr>
+            <w:proofErr w:type="spellStart"/>
+            <w:r>
+              <w:rPr>
+                <w:b/>
+                <w:bCs/>
+              </w:rPr>
+              <w:t>c</w:t>
+            </w:r>
+            <w:r>
+              <w:rPr>
+                <w:b/>
+                <w:bCs/>
+              </w:rPr>
+              <w:t>ivitas-backend</w:t>
+            </w:r>
+            <w:proofErr w:type="spellEnd"/>
           </w:p>
         </w:tc>
       </w:tr>
@@ -262,7 +304,21 @@
                 <w:b/>
                 <w:bCs/>
               </w:rPr>
-              <w:t>Ano: 5º</w:t>
+              <w:t xml:space="preserve">Ano: </w:t>
+            </w:r>
+            <w:r>
+              <w:rPr>
+                <w:b/>
+                <w:bCs/>
+              </w:rPr>
+              <w:t>4</w:t>
+            </w:r>
+            <w:r>
+              <w:rPr>
+                <w:b/>
+                <w:bCs/>
+              </w:rPr>
+              <w:t>º</w:t>
             </w:r>
           </w:p>
         </w:tc>
@@ -330,7 +386,16 @@
             <w:tcW w:w="10201" w:type="dxa"/>
             <w:gridSpan w:val="4"/>
           </w:tcPr>
-          <w:p/>
+          <w:p>
+            <w:proofErr w:type="spellStart"/>
+            <w:r>
+              <w:t>Adryan</w:t>
+            </w:r>
+            <w:proofErr w:type="spellEnd"/>
+            <w:r>
+              <w:t xml:space="preserve"> Thiago de Oliveira Francisco</w:t>
+            </w:r>
+          </w:p>
         </w:tc>
       </w:tr>
       <w:tr>
@@ -339,7 +404,19 @@
             <w:tcW w:w="10201" w:type="dxa"/>
             <w:gridSpan w:val="4"/>
           </w:tcPr>
-          <w:p/>
+          <w:p>
+            <w:r>
+              <w:t xml:space="preserve">Enzo </w:t>
+            </w:r>
+            <w:proofErr w:type="spellStart"/>
+            <w:r>
+              <w:t>Stafuza</w:t>
+            </w:r>
+            <w:proofErr w:type="spellEnd"/>
+            <w:r>
+              <w:t xml:space="preserve"> dos Santos</w:t>
+            </w:r>
+          </w:p>
         </w:tc>
       </w:tr>
       <w:tr>
@@ -348,7 +425,11 @@
             <w:tcW w:w="10201" w:type="dxa"/>
             <w:gridSpan w:val="4"/>
           </w:tcPr>
-          <w:p/>
+          <w:p>
+            <w:r>
+              <w:t>Gabriel de Oliveira Trinca</w:t>
+            </w:r>
+          </w:p>
         </w:tc>
       </w:tr>
       <w:tr>
@@ -357,7 +438,11 @@
             <w:tcW w:w="10201" w:type="dxa"/>
             <w:gridSpan w:val="4"/>
           </w:tcPr>
-          <w:p/>
+          <w:p>
+            <w:r>
+              <w:t>Giovanni da Silva Nascimento</w:t>
+            </w:r>
+          </w:p>
         </w:tc>
       </w:tr>
       <w:tr>
@@ -366,7 +451,37 @@
             <w:tcW w:w="10201" w:type="dxa"/>
             <w:gridSpan w:val="4"/>
           </w:tcPr>
-          <w:p/>
+          <w:p>
+            <w:r>
+              <w:t>Guilherme Henrique de Oliveira</w:t>
+            </w:r>
+          </w:p>
+        </w:tc>
+      </w:tr>
+      <w:tr>
+        <w:tc>
+          <w:tcPr>
+            <w:tcW w:w="10201" w:type="dxa"/>
+            <w:gridSpan w:val="4"/>
+          </w:tcPr>
+          <w:p>
+            <w:r>
+              <w:t>Wendell Alves Nascimento</w:t>
+            </w:r>
+          </w:p>
+        </w:tc>
+      </w:tr>
+      <w:tr>
+        <w:tc>
+          <w:tcPr>
+            <w:tcW w:w="10201" w:type="dxa"/>
+            <w:gridSpan w:val="4"/>
+          </w:tcPr>
+          <w:p>
+            <w:r>
+              <w:t>Yasmin Basso Moura</w:t>
+            </w:r>
+          </w:p>
         </w:tc>
       </w:tr>
     </w:tbl>
@@ -414,8 +529,13 @@
             <w:tcW w:w="754" w:type="dxa"/>
           </w:tcPr>
           <w:p>
-            <w:r>
-              <w:t>Task#</w:t>
+            <w:proofErr w:type="spellStart"/>
+            <w:r>
+              <w:t>Task</w:t>
+            </w:r>
+            <w:proofErr w:type="spellEnd"/>
+            <w:r>
+              <w:t>#</w:t>
             </w:r>
           </w:p>
         </w:tc>
@@ -436,9 +556,11 @@
             <w:tcW w:w="1541" w:type="dxa"/>
           </w:tcPr>
           <w:p>
+            <w:proofErr w:type="gramStart"/>
             <w:r>
               <w:t>Start Date</w:t>
             </w:r>
+            <w:proofErr w:type="gramEnd"/>
           </w:p>
         </w:tc>
         <w:tc>
@@ -457,25 +579,46 @@
           <w:tcPr>
             <w:tcW w:w="754" w:type="dxa"/>
           </w:tcPr>
-          <w:p/>
+          <w:p>
+            <w:r>
+              <w:t>002</w:t>
+            </w:r>
+          </w:p>
         </w:tc>
         <w:tc>
           <w:tcPr>
             <w:tcW w:w="6234" w:type="dxa"/>
           </w:tcPr>
-          <w:p/>
+          <w:p>
+            <w:pPr>
+              <w:jc w:val="center"/>
+            </w:pPr>
+            <w:r>
+              <w:t>Analisar e modificar (se necessário) a parte de Definição de Atores</w:t>
+            </w:r>
+          </w:p>
         </w:tc>
         <w:tc>
           <w:tcPr>
             <w:tcW w:w="1541" w:type="dxa"/>
           </w:tcPr>
-          <w:p/>
+          <w:p>
+            <w:r>
+              <w:t>24/09/2025</w:t>
+            </w:r>
+          </w:p>
         </w:tc>
         <w:tc>
           <w:tcPr>
             <w:tcW w:w="1672" w:type="dxa"/>
           </w:tcPr>
-          <w:p/>
+          <w:p>
+            <w:r>
+              <w:t>29/09/2025</w:t>
+            </w:r>
+            <w:bookmarkStart w:id="0" w:name="_GoBack"/>
+            <w:bookmarkEnd w:id="0"/>
+          </w:p>
         </w:tc>
       </w:tr>
       <w:tr>
@@ -587,12 +730,21 @@
                 <w:bCs/>
               </w:rPr>
             </w:pPr>
-            <w:r>
-              <w:rPr>
-                <w:b/>
-                <w:bCs/>
-              </w:rPr>
-              <w:t xml:space="preserve">Task </w:t>
+            <w:proofErr w:type="spellStart"/>
+            <w:r>
+              <w:rPr>
+                <w:b/>
+                <w:bCs/>
+              </w:rPr>
+              <w:t>Task</w:t>
+            </w:r>
+            <w:proofErr w:type="spellEnd"/>
+            <w:r>
+              <w:rPr>
+                <w:b/>
+                <w:bCs/>
+              </w:rPr>
+              <w:t xml:space="preserve"> </w:t>
             </w:r>
             <w:proofErr w:type="spellStart"/>
             <w:r>
@@ -695,37 +847,97 @@
           <w:tcPr>
             <w:tcW w:w="828" w:type="dxa"/>
           </w:tcPr>
+          <w:p>
+            <w:r>
+              <w:t>002</w:t>
+            </w:r>
+          </w:p>
+        </w:tc>
+        <w:tc>
+          <w:tcPr>
+            <w:tcW w:w="2971" w:type="dxa"/>
+          </w:tcPr>
+          <w:p>
+            <w:r>
+              <w:t>Revisar e ajustar a definição de atores no sistema, garantindo que todos os papéis estejam corretos, completos e bem descritos.</w:t>
+            </w:r>
+          </w:p>
+        </w:tc>
+        <w:tc>
+          <w:tcPr>
+            <w:tcW w:w="1441" w:type="dxa"/>
+          </w:tcPr>
+          <w:p>
+            <w:proofErr w:type="spellStart"/>
+            <w:r>
+              <w:t>Adryan</w:t>
+            </w:r>
+            <w:proofErr w:type="spellEnd"/>
+          </w:p>
+          <w:p>
+            <w:r>
+              <w:t>Enzo</w:t>
+            </w:r>
+          </w:p>
+          <w:p>
+            <w:r>
+              <w:t>Gabriel</w:t>
+            </w:r>
+          </w:p>
+          <w:p>
+            <w:r>
+              <w:t>Giovanni</w:t>
+            </w:r>
+          </w:p>
+          <w:p>
+            <w:r>
+              <w:t>Guilherme</w:t>
+            </w:r>
+          </w:p>
+          <w:p>
+            <w:r>
+              <w:t>Wendell</w:t>
+            </w:r>
+          </w:p>
+          <w:p>
+            <w:r>
+              <w:t>Y</w:t>
+            </w:r>
+            <w:r>
+              <w:t>asmin</w:t>
+            </w:r>
+          </w:p>
           <w:p/>
         </w:tc>
         <w:tc>
           <w:tcPr>
-            <w:tcW w:w="2971" w:type="dxa"/>
-          </w:tcPr>
-          <w:p/>
-        </w:tc>
-        <w:tc>
-          <w:tcPr>
-            <w:tcW w:w="1441" w:type="dxa"/>
-          </w:tcPr>
-          <w:p/>
-        </w:tc>
-        <w:tc>
-          <w:tcPr>
             <w:tcW w:w="1418" w:type="dxa"/>
           </w:tcPr>
-          <w:p/>
+          <w:p>
+            <w:r>
+              <w:t>Entregue</w:t>
+            </w:r>
+          </w:p>
         </w:tc>
         <w:tc>
           <w:tcPr>
             <w:tcW w:w="1842" w:type="dxa"/>
           </w:tcPr>
-          <w:p/>
+          <w:p>
+            <w:r>
+              <w:t>10</w:t>
+            </w:r>
+          </w:p>
         </w:tc>
         <w:tc>
           <w:tcPr>
             <w:tcW w:w="1683" w:type="dxa"/>
           </w:tcPr>
-          <w:p/>
+          <w:p>
+            <w:r>
+              <w:t>10</w:t>
+            </w:r>
+          </w:p>
         </w:tc>
       </w:tr>
       <w:tr>
@@ -843,19 +1055,9 @@
     </w:p>
     <w:p>
       <w:r>
-        <w:t xml:space="preserve">** Descrição do que foi designado </w:t>
-      </w:r>
-      <w:proofErr w:type="spellStart"/>
-      <w:r>
-        <w:t>na</w:t>
-      </w:r>
-      <w:proofErr w:type="spellEnd"/>
-      <w:r>
-        <w:t xml:space="preserve"> sprint</w:t>
+        <w:t>Revisar e ajustar a definição de atores no sistema, garantindo que todos os papéis estejam corretos, completos e bem descritos.</w:t>
       </w:r>
     </w:p>
-    <w:p/>
-    <w:p/>
     <w:p/>
     <w:tbl>
       <w:tblPr>
@@ -910,33 +1112,254 @@
     </w:tbl>
     <w:p/>
     <w:p>
+      <w:pPr>
+        <w:pStyle w:val="PargrafodaLista"/>
+        <w:numPr>
+          <w:ilvl w:val="0"/>
+          <w:numId w:val="6"/>
+        </w:numPr>
+        <w:rPr>
+          <w:rFonts w:ascii="Aptos" w:eastAsia="Aptos" w:hAnsi="Aptos" w:cs="Aptos"/>
+          <w:color w:val="000000" w:themeColor="text1"/>
+        </w:rPr>
+      </w:pPr>
       <w:r>
-        <w:t>Descrição do que foi produzido, com diagramas de caso de uso, diagrama de sequência, diagrama com as classes afetadas nas sprint.</w:t>
+        <w:rPr>
+          <w:rFonts w:ascii="Aptos" w:eastAsia="Aptos" w:hAnsi="Aptos" w:cs="Aptos"/>
+          <w:color w:val="000000" w:themeColor="text1"/>
+        </w:rPr>
+        <w:t>Definição dos Atores</w:t>
       </w:r>
     </w:p>
     <w:p>
+      <w:pPr>
+        <w:rPr>
+          <w:rFonts w:ascii="Aptos" w:eastAsia="Aptos" w:hAnsi="Aptos" w:cs="Aptos"/>
+          <w:color w:val="000000" w:themeColor="text1"/>
+        </w:rPr>
+      </w:pPr>
       <w:r>
-        <w:t>Se necessário colocar outros diagramas.</w:t>
+        <w:rPr>
+          <w:rFonts w:ascii="Aptos" w:eastAsia="Aptos" w:hAnsi="Aptos" w:cs="Aptos"/>
+          <w:color w:val="000000" w:themeColor="text1"/>
+        </w:rPr>
+        <w:t>Foi preciso refazer a parte de definição dos atores, os atores não mudaram, mas suas descrições sim.</w:t>
       </w:r>
     </w:p>
     <w:p>
+      <w:pPr>
+        <w:rPr>
+          <w:rFonts w:ascii="Aptos" w:eastAsia="Aptos" w:hAnsi="Aptos" w:cs="Aptos"/>
+          <w:color w:val="000000" w:themeColor="text1"/>
+        </w:rPr>
+      </w:pPr>
       <w:r>
-        <w:t>Colocar imagens das telas produzidas.</w:t>
+        <w:rPr>
+          <w:rFonts w:ascii="Aptos" w:eastAsia="Aptos" w:hAnsi="Aptos" w:cs="Aptos"/>
+          <w:color w:val="000000" w:themeColor="text1"/>
+        </w:rPr>
+        <w:t>Os principais erros encontrados foram o do ator Público encontrado em algumas descrições, sendo que esse ator não existe no sistema, ele é definido como Visitante. O ator Funcionário nas descrições estava sendo descrito como um Visitante, fazia a mesma coisa que um Visitante, porém, tinha um nome diferente .</w:t>
       </w:r>
     </w:p>
     <w:p>
+      <w:pPr>
+        <w:rPr>
+          <w:rFonts w:ascii="Aptos" w:eastAsia="Aptos" w:hAnsi="Aptos" w:cs="Aptos"/>
+          <w:color w:val="000000" w:themeColor="text1"/>
+        </w:rPr>
+      </w:pPr>
       <w:r>
-        <w:t>Descrever o que foi bem durante a sprint – aprendizados.</w:t>
+        <w:rPr>
+          <w:rFonts w:ascii="Aptos" w:eastAsia="Aptos" w:hAnsi="Aptos" w:cs="Aptos"/>
+          <w:color w:val="000000" w:themeColor="text1"/>
+        </w:rPr>
+        <w:lastRenderedPageBreak/>
+        <w:t>Os textos atualizados ficaram assim:</w:t>
       </w:r>
     </w:p>
     <w:p>
+      <w:pPr>
+        <w:spacing w:line="360" w:lineRule="auto"/>
+        <w:ind w:left="179" w:right="288" w:firstLine="850"/>
+        <w:jc w:val="both"/>
+        <w:rPr>
+          <w:rFonts w:ascii="Aptos" w:eastAsia="Aptos" w:hAnsi="Aptos" w:cs="Aptos"/>
+          <w:color w:val="000000" w:themeColor="text1"/>
+        </w:rPr>
+      </w:pPr>
       <w:r>
-        <w:t>Descrever o que não pode ser implementado com justificativa.</w:t>
+        <w:rPr>
+          <w:rFonts w:ascii="Aptos" w:eastAsia="Aptos" w:hAnsi="Aptos" w:cs="Aptos"/>
+          <w:color w:val="000000" w:themeColor="text1"/>
+          <w:lang w:val="pt-PT"/>
+        </w:rPr>
+        <w:t xml:space="preserve">Conforme apresentado na Figura 9, a definição estrutural no diagrama de classes para o diagrama de atores evita o uso de herança. Essa escolha é fundamentada nos princípios do </w:t>
+      </w:r>
+      <w:r>
+        <w:rPr>
+          <w:rFonts w:ascii="Aptos" w:eastAsia="Aptos" w:hAnsi="Aptos" w:cs="Aptos"/>
+          <w:i/>
+          <w:iCs/>
+          <w:color w:val="000000" w:themeColor="text1"/>
+          <w:lang w:val="pt-PT"/>
+        </w:rPr>
+        <w:t>SOLID</w:t>
+      </w:r>
+      <w:r>
+        <w:rPr>
+          <w:rFonts w:ascii="Aptos" w:eastAsia="Aptos" w:hAnsi="Aptos" w:cs="Aptos"/>
+          <w:color w:val="000000" w:themeColor="text1"/>
+          <w:vertAlign w:val="superscript"/>
+          <w:lang w:val="pt-PT"/>
+        </w:rPr>
+        <w:t>1</w:t>
+      </w:r>
+      <w:r>
+        <w:rPr>
+          <w:rFonts w:ascii="Aptos" w:eastAsia="Aptos" w:hAnsi="Aptos" w:cs="Aptos"/>
+          <w:color w:val="000000" w:themeColor="text1"/>
+          <w:lang w:val="pt-PT"/>
+        </w:rPr>
+        <w:t>, em especial no Princípio da Substituição de Liskov (LSP) e no Princípio de Segregação de Interfaces (ISP). De acordo com esses princípios, deve-se priorizar o uso da composição em vez da herança, pois a composição oferece maior flexibilidade e modularidade. Além disso, essa abordagem reduz o acoplamento entre as classes, mantendo a coesão e a consistência do sistema (Aniche, 2011).</w:t>
       </w:r>
     </w:p>
     <w:p>
+      <w:pPr>
+        <w:spacing w:before="3" w:line="360" w:lineRule="auto"/>
+        <w:ind w:left="179" w:right="294" w:firstLine="850"/>
+        <w:jc w:val="both"/>
+        <w:rPr>
+          <w:rFonts w:ascii="Aptos" w:eastAsia="Aptos" w:hAnsi="Aptos" w:cs="Aptos"/>
+          <w:color w:val="000000" w:themeColor="text1"/>
+        </w:rPr>
+      </w:pPr>
       <w:r>
-        <w:t>Descrever os testes realizados (se necessário)</w:t>
+        <w:rPr>
+          <w:rFonts w:ascii="Aptos" w:eastAsia="Aptos" w:hAnsi="Aptos" w:cs="Aptos"/>
+          <w:color w:val="000000" w:themeColor="text1"/>
+          <w:lang w:val="pt-PT"/>
+        </w:rPr>
+        <w:t>Na Figura 9 também é apresentado a classe “Tipo Usuário”, que é classificada como um estereótipo do tipo &lt;&lt;</w:t>
+      </w:r>
+      <w:r>
+        <w:rPr>
+          <w:rFonts w:ascii="Aptos" w:eastAsia="Aptos" w:hAnsi="Aptos" w:cs="Aptos"/>
+          <w:i/>
+          <w:iCs/>
+          <w:color w:val="000000" w:themeColor="text1"/>
+          <w:lang w:val="pt-PT"/>
+        </w:rPr>
+        <w:t>enumeration</w:t>
+      </w:r>
+      <w:r>
+        <w:rPr>
+          <w:rFonts w:ascii="Aptos" w:eastAsia="Aptos" w:hAnsi="Aptos" w:cs="Aptos"/>
+          <w:color w:val="000000" w:themeColor="text1"/>
+          <w:lang w:val="pt-PT"/>
+        </w:rPr>
+        <w:t>&gt;&gt;. De acordo com Guedes (2018, p. 171), “essa classe lista todos os valores válidos que um tipo de dados pode assumir”. Ou seja, no contexto do sistema, o dado em questão é o “Usuário” e os valores que ele pode assumir são “Visitante”, “Funcionário” e “Administrador”. Isso possibilita a definição de diferentes níveis de acesso ao sistema, garantindo que cada tipo de usuário tenha permissões específicas, de acordo com suas responsabilidades e funções dentro da plataforma.</w:t>
+      </w:r>
+    </w:p>
+    <w:p>
+      <w:pPr>
+        <w:spacing w:line="360" w:lineRule="auto"/>
+        <w:ind w:left="179" w:right="295" w:firstLine="850"/>
+        <w:jc w:val="both"/>
+        <w:rPr>
+          <w:rFonts w:ascii="Aptos" w:eastAsia="Aptos" w:hAnsi="Aptos" w:cs="Aptos"/>
+          <w:color w:val="000000" w:themeColor="text1"/>
+        </w:rPr>
+      </w:pPr>
+      <w:r>
+        <w:rPr>
+          <w:rFonts w:ascii="Aptos" w:eastAsia="Aptos" w:hAnsi="Aptos" w:cs="Aptos"/>
+          <w:color w:val="000000" w:themeColor="text1"/>
+          <w:lang w:val="pt-PT"/>
+        </w:rPr>
+        <w:t>O ator "Pessoa" (Figura 9) representa coletivamente todos os tipos de usuários envolvidos, incluindo Administradores, Funcionários e o Visitante. Esse ator abrange todas as interações possíveis no sistema, desde administração e manutenção por parte dos Administradores, até as operações diárias dos Funcionários responsáveis pelo registro e acompanhamento das despesas. Além disso, o Visitante, como Pessoa, pode acessar informações específicas de forma mais restrita, promovendo transparência nas atividades financeiras da prefeitura. O ator "Pessoa" encapsula as diversas necessidades e permissões associadas aos diferentes papéis dentro do contexto do sistema de gerenciamento de despesas.</w:t>
+      </w:r>
+    </w:p>
+    <w:p>
+      <w:pPr>
+        <w:ind w:left="321" w:firstLine="708"/>
+        <w:rPr>
+          <w:rFonts w:ascii="Aptos" w:eastAsia="Aptos" w:hAnsi="Aptos" w:cs="Aptos"/>
+          <w:color w:val="000000" w:themeColor="text1"/>
+        </w:rPr>
+      </w:pPr>
+      <w:r>
+        <w:rPr>
+          <w:rFonts w:ascii="Aptos" w:eastAsia="Aptos" w:hAnsi="Aptos" w:cs="Aptos"/>
+          <w:color w:val="000000" w:themeColor="text1"/>
+          <w:lang w:val="pt-PT"/>
+        </w:rPr>
+        <w:t>O ator "Administrador" (Figura 9) desempenha o papel central na administração e supervisão do sistema. Suas responsabilidades incluem a configuração e manutenção do sistema, a gestão de usuários e permissões, a definição de parâmetros do sistema, e a geração de relatórios estratégicos. O Administrador possui o controle global sobre as funcionalidades do sistema, garantindo que este atenda aos requisitos da prefeitura e que as operações sejam conduzidas de maneira eficiente e segura.</w:t>
+      </w:r>
+    </w:p>
+    <w:p>
+      <w:pPr>
+        <w:spacing w:line="360" w:lineRule="auto"/>
+        <w:ind w:left="179" w:right="296" w:firstLine="850"/>
+        <w:jc w:val="both"/>
+        <w:rPr>
+          <w:rFonts w:ascii="Aptos" w:eastAsia="Aptos" w:hAnsi="Aptos" w:cs="Aptos"/>
+          <w:color w:val="000000" w:themeColor="text1"/>
+        </w:rPr>
+      </w:pPr>
+      <w:r>
+        <w:rPr>
+          <w:rFonts w:ascii="Aptos" w:eastAsia="Aptos" w:hAnsi="Aptos" w:cs="Aptos"/>
+          <w:color w:val="000000" w:themeColor="text1"/>
+          <w:lang w:val="pt-PT"/>
+        </w:rPr>
+        <w:t>O ator "Funcionário" (Figura 9) representa os usuários operacionais que utilizam o sistema para realizar tarefas específicas relacionadas ao gerenciamento e registro de despesas. Suas responsabilidades podem incluir o cadastro de despesas, a associação de despesas a instituições, a consulta de relatórios e a interação direta com as funcionalidades cotidianas do sistema. O Funcionário desempenha um papel crucial na entrada de dados e na execução de operações diárias para garantir a precisão e integridade das informações registradas no sistema de gerenciamento de despesas.</w:t>
+      </w:r>
+    </w:p>
+    <w:p>
+      <w:pPr>
+        <w:spacing w:line="360" w:lineRule="auto"/>
+        <w:ind w:left="179" w:right="298" w:firstLine="850"/>
+        <w:jc w:val="both"/>
+        <w:rPr>
+          <w:rFonts w:ascii="Aptos" w:eastAsia="Aptos" w:hAnsi="Aptos" w:cs="Aptos"/>
+          <w:color w:val="000000" w:themeColor="text1"/>
+        </w:rPr>
+      </w:pPr>
+      <w:r>
+        <w:rPr>
+          <w:rFonts w:ascii="Aptos" w:eastAsia="Aptos" w:hAnsi="Aptos" w:cs="Aptos"/>
+          <w:color w:val="000000" w:themeColor="text1"/>
+          <w:lang w:val="pt-PT"/>
+        </w:rPr>
+        <w:t xml:space="preserve">O ator "Visitante" (Figura 9) refere-se aos usuários externos, como cidadãos, contribuintes ou qualquer outra parte interessada que tenha acesso limitado ao sistema. O acesso do Visitante geralmente é direcionado para consultar informações públicas sobre despesas, orçamentos ou relatórios que a prefeitura opta por tornar disponíveis. Essa categoria de usuários pode visualizar dados específicos, geralmente de forma transparente, contribuindo para a prestação de contas e transparência na gestão financeira da prefeitura. Suas </w:t>
+      </w:r>
+      <w:r>
+        <w:rPr>
+          <w:rFonts w:ascii="Aptos" w:eastAsia="Aptos" w:hAnsi="Aptos" w:cs="Aptos"/>
+          <w:color w:val="000000" w:themeColor="text1"/>
+          <w:lang w:val="pt-PT"/>
+        </w:rPr>
+        <w:lastRenderedPageBreak/>
+        <w:t>interações são frequentemente limitadas a consultas e visualização de informações, sem permissão para realizar ações de entrada de dados ou configuração no sistema.</w:t>
+      </w:r>
+    </w:p>
+    <w:p>
+      <w:pPr>
+        <w:spacing w:before="1" w:line="360" w:lineRule="auto"/>
+        <w:ind w:left="179" w:right="290" w:firstLine="850"/>
+        <w:jc w:val="both"/>
+        <w:rPr>
+          <w:rFonts w:ascii="Aptos" w:eastAsia="Aptos" w:hAnsi="Aptos" w:cs="Aptos"/>
+          <w:color w:val="000000" w:themeColor="text1"/>
+        </w:rPr>
+      </w:pPr>
+      <w:r>
+        <w:rPr>
+          <w:rFonts w:ascii="Aptos" w:eastAsia="Aptos" w:hAnsi="Aptos" w:cs="Aptos"/>
+          <w:color w:val="000000" w:themeColor="text1"/>
+          <w:lang w:val="pt-PT"/>
+        </w:rPr>
+        <w:t>O ator "Sistema" (Figura 9) refere-se à própria aplicação ou plataforma. Este ator não representa um usuário humano, mas sim o conjunto de funcionalidades, processos e lógicas incorporadas no software. O Sistema desempenha um papel central na automação de tarefas, processamento de dados, armazenamento de informações e execução de operações específicas relacionadas ao gerenciamento de despesas. Ele é projetado para suportar os diferentes papéis de usuários (Administrador, Funcionário, Visitante) e facilitar eficientemente as operações e análises relacionadas às atividades financeiras da prefeitura.</w:t>
       </w:r>
     </w:p>
     <w:p/>
@@ -953,7 +1376,6 @@
           <w:sz w:val="24"/>
           <w:szCs w:val="24"/>
         </w:rPr>
-        <w:lastRenderedPageBreak/>
         <w:t>Assinaturas</w:t>
       </w:r>
     </w:p>
@@ -968,7 +1390,7 @@
 </file>
 
 <file path=word/endnotes.xml><?xml version="1.0" encoding="utf-8"?>
-<w:endnotes xmlns:wpc="http://schemas.microsoft.com/office/word/2010/wordprocessingCanvas" xmlns:cx="http://schemas.microsoft.com/office/drawing/2014/chartex" xmlns:cx1="http://schemas.microsoft.com/office/drawing/2015/9/8/chartex" xmlns:cx2="http://schemas.microsoft.com/office/drawing/2015/10/21/chartex" xmlns:cx3="http://schemas.microsoft.com/office/drawing/2016/5/9/chartex" xmlns:cx4="http://schemas.microsoft.com/office/drawing/2016/5/10/chartex" xmlns:cx5="http://schemas.microsoft.com/office/drawing/2016/5/11/chartex" xmlns:cx6="http://schemas.microsoft.com/office/drawing/2016/5/12/chartex" xmlns:cx7="http://schemas.microsoft.com/office/drawing/2016/5/13/chartex" xmlns:cx8="http://schemas.microsoft.com/office/drawing/2016/5/14/chartex" xmlns:mc="http://schemas.openxmlformats.org/markup-compatibility/2006" xmlns:aink="http://schemas.microsoft.com/office/drawing/2016/ink" xmlns:am3d="http://schemas.microsoft.com/office/drawing/2017/model3d" xmlns:o="urn:schemas-microsoft-com:office:office" xmlns:oel="http://schemas.microsoft.com/office/2019/extlst" xmlns:r="http://schemas.openxmlformats.org/officeDocument/2006/relationships" xmlns:m="http://schemas.openxmlformats.org/officeDocument/2006/math" xmlns:v="urn:schemas-microsoft-com:vml" xmlns:wp14="http://schemas.microsoft.com/office/word/2010/wordprocessingDrawing" xmlns:wp="http://schemas.openxmlformats.org/drawingml/2006/wordprocessingDrawing" xmlns:w10="urn:schemas-microsoft-com:office:word" xmlns:w="http://schemas.openxmlformats.org/wordprocessingml/2006/main" xmlns:w14="http://schemas.microsoft.com/office/word/2010/wordml" xmlns:w15="http://schemas.microsoft.com/office/word/2012/wordml" xmlns:w16cex="http://schemas.microsoft.com/office/word/2018/wordml/cex" xmlns:w16cid="http://schemas.microsoft.com/office/word/2016/wordml/cid" xmlns:w16="http://schemas.microsoft.com/office/word/2018/wordml" xmlns:w16du="http://schemas.microsoft.com/office/word/2023/wordml/word16du" xmlns:w16sdtdh="http://schemas.microsoft.com/office/word/2020/wordml/sdtdatahash" xmlns:w16sdtfl="http://schemas.microsoft.com/office/word/2024/wordml/sdtformatlock" xmlns:w16se="http://schemas.microsoft.com/office/word/2015/wordml/symex" xmlns:wpg="http://schemas.microsoft.com/office/word/2010/wordprocessingGroup" xmlns:wpi="http://schemas.microsoft.com/office/word/2010/wordprocessingInk" xmlns:wne="http://schemas.microsoft.com/office/word/2006/wordml" xmlns:wps="http://schemas.microsoft.com/office/word/2010/wordprocessingShape" mc:Ignorable="w14 w15 w16se w16cid w16 w16cex w16sdtdh w16sdtfl w16du wp14">
+<w:endnotes xmlns:wpc="http://schemas.microsoft.com/office/word/2010/wordprocessingCanvas" xmlns:cx="http://schemas.microsoft.com/office/drawing/2014/chartex" xmlns:cx1="http://schemas.microsoft.com/office/drawing/2015/9/8/chartex" xmlns:cx2="http://schemas.microsoft.com/office/drawing/2015/10/21/chartex" xmlns:cx3="http://schemas.microsoft.com/office/drawing/2016/5/9/chartex" xmlns:cx4="http://schemas.microsoft.com/office/drawing/2016/5/10/chartex" xmlns:cx5="http://schemas.microsoft.com/office/drawing/2016/5/11/chartex" xmlns:cx6="http://schemas.microsoft.com/office/drawing/2016/5/12/chartex" xmlns:cx7="http://schemas.microsoft.com/office/drawing/2016/5/13/chartex" xmlns:cx8="http://schemas.microsoft.com/office/drawing/2016/5/14/chartex" xmlns:mc="http://schemas.openxmlformats.org/markup-compatibility/2006" xmlns:aink="http://schemas.microsoft.com/office/drawing/2016/ink" xmlns:am3d="http://schemas.microsoft.com/office/drawing/2017/model3d" xmlns:o="urn:schemas-microsoft-com:office:office" xmlns:r="http://schemas.openxmlformats.org/officeDocument/2006/relationships" xmlns:m="http://schemas.openxmlformats.org/officeDocument/2006/math" xmlns:v="urn:schemas-microsoft-com:vml" xmlns:wp14="http://schemas.microsoft.com/office/word/2010/wordprocessingDrawing" xmlns:wp="http://schemas.openxmlformats.org/drawingml/2006/wordprocessingDrawing" xmlns:w10="urn:schemas-microsoft-com:office:word" xmlns:w="http://schemas.openxmlformats.org/wordprocessingml/2006/main" xmlns:w14="http://schemas.microsoft.com/office/word/2010/wordml" xmlns:w15="http://schemas.microsoft.com/office/word/2012/wordml" xmlns:w16cid="http://schemas.microsoft.com/office/word/2016/wordml/cid" xmlns:w16se="http://schemas.microsoft.com/office/word/2015/wordml/symex" xmlns:wpg="http://schemas.microsoft.com/office/word/2010/wordprocessingGroup" xmlns:wpi="http://schemas.microsoft.com/office/word/2010/wordprocessingInk" xmlns:wne="http://schemas.microsoft.com/office/word/2006/wordml" xmlns:wps="http://schemas.microsoft.com/office/word/2010/wordprocessingShape" mc:Ignorable="w14 w15 w16se w16cid wp14">
   <w:endnote w:type="separator" w:id="-1">
     <w:p>
       <w:pPr>
@@ -993,7 +1415,7 @@
 </file>
 
 <file path=word/footnotes.xml><?xml version="1.0" encoding="utf-8"?>
-<w:footnotes xmlns:wpc="http://schemas.microsoft.com/office/word/2010/wordprocessingCanvas" xmlns:cx="http://schemas.microsoft.com/office/drawing/2014/chartex" xmlns:cx1="http://schemas.microsoft.com/office/drawing/2015/9/8/chartex" xmlns:cx2="http://schemas.microsoft.com/office/drawing/2015/10/21/chartex" xmlns:cx3="http://schemas.microsoft.com/office/drawing/2016/5/9/chartex" xmlns:cx4="http://schemas.microsoft.com/office/drawing/2016/5/10/chartex" xmlns:cx5="http://schemas.microsoft.com/office/drawing/2016/5/11/chartex" xmlns:cx6="http://schemas.microsoft.com/office/drawing/2016/5/12/chartex" xmlns:cx7="http://schemas.microsoft.com/office/drawing/2016/5/13/chartex" xmlns:cx8="http://schemas.microsoft.com/office/drawing/2016/5/14/chartex" xmlns:mc="http://schemas.openxmlformats.org/markup-compatibility/2006" xmlns:aink="http://schemas.microsoft.com/office/drawing/2016/ink" xmlns:am3d="http://schemas.microsoft.com/office/drawing/2017/model3d" xmlns:o="urn:schemas-microsoft-com:office:office" xmlns:oel="http://schemas.microsoft.com/office/2019/extlst" xmlns:r="http://schemas.openxmlformats.org/officeDocument/2006/relationships" xmlns:m="http://schemas.openxmlformats.org/officeDocument/2006/math" xmlns:v="urn:schemas-microsoft-com:vml" xmlns:wp14="http://schemas.microsoft.com/office/word/2010/wordprocessingDrawing" xmlns:wp="http://schemas.openxmlformats.org/drawingml/2006/wordprocessingDrawing" xmlns:w10="urn:schemas-microsoft-com:office:word" xmlns:w="http://schemas.openxmlformats.org/wordprocessingml/2006/main" xmlns:w14="http://schemas.microsoft.com/office/word/2010/wordml" xmlns:w15="http://schemas.microsoft.com/office/word/2012/wordml" xmlns:w16cex="http://schemas.microsoft.com/office/word/2018/wordml/cex" xmlns:w16cid="http://schemas.microsoft.com/office/word/2016/wordml/cid" xmlns:w16="http://schemas.microsoft.com/office/word/2018/wordml" xmlns:w16du="http://schemas.microsoft.com/office/word/2023/wordml/word16du" xmlns:w16sdtdh="http://schemas.microsoft.com/office/word/2020/wordml/sdtdatahash" xmlns:w16sdtfl="http://schemas.microsoft.com/office/word/2024/wordml/sdtformatlock" xmlns:w16se="http://schemas.microsoft.com/office/word/2015/wordml/symex" xmlns:wpg="http://schemas.microsoft.com/office/word/2010/wordprocessingGroup" xmlns:wpi="http://schemas.microsoft.com/office/word/2010/wordprocessingInk" xmlns:wne="http://schemas.microsoft.com/office/word/2006/wordml" xmlns:wps="http://schemas.microsoft.com/office/word/2010/wordprocessingShape" mc:Ignorable="w14 w15 w16se w16cid w16 w16cex w16sdtdh w16sdtfl w16du wp14">
+<w:footnotes xmlns:wpc="http://schemas.microsoft.com/office/word/2010/wordprocessingCanvas" xmlns:cx="http://schemas.microsoft.com/office/drawing/2014/chartex" xmlns:cx1="http://schemas.microsoft.com/office/drawing/2015/9/8/chartex" xmlns:cx2="http://schemas.microsoft.com/office/drawing/2015/10/21/chartex" xmlns:cx3="http://schemas.microsoft.com/office/drawing/2016/5/9/chartex" xmlns:cx4="http://schemas.microsoft.com/office/drawing/2016/5/10/chartex" xmlns:cx5="http://schemas.microsoft.com/office/drawing/2016/5/11/chartex" xmlns:cx6="http://schemas.microsoft.com/office/drawing/2016/5/12/chartex" xmlns:cx7="http://schemas.microsoft.com/office/drawing/2016/5/13/chartex" xmlns:cx8="http://schemas.microsoft.com/office/drawing/2016/5/14/chartex" xmlns:mc="http://schemas.openxmlformats.org/markup-compatibility/2006" xmlns:aink="http://schemas.microsoft.com/office/drawing/2016/ink" xmlns:am3d="http://schemas.microsoft.com/office/drawing/2017/model3d" xmlns:o="urn:schemas-microsoft-com:office:office" xmlns:r="http://schemas.openxmlformats.org/officeDocument/2006/relationships" xmlns:m="http://schemas.openxmlformats.org/officeDocument/2006/math" xmlns:v="urn:schemas-microsoft-com:vml" xmlns:wp14="http://schemas.microsoft.com/office/word/2010/wordprocessingDrawing" xmlns:wp="http://schemas.openxmlformats.org/drawingml/2006/wordprocessingDrawing" xmlns:w10="urn:schemas-microsoft-com:office:word" xmlns:w="http://schemas.openxmlformats.org/wordprocessingml/2006/main" xmlns:w14="http://schemas.microsoft.com/office/word/2010/wordml" xmlns:w15="http://schemas.microsoft.com/office/word/2012/wordml" xmlns:w16cid="http://schemas.microsoft.com/office/word/2016/wordml/cid" xmlns:w16se="http://schemas.microsoft.com/office/word/2015/wordml/symex" xmlns:wpg="http://schemas.microsoft.com/office/word/2010/wordprocessingGroup" xmlns:wpi="http://schemas.microsoft.com/office/word/2010/wordprocessingInk" xmlns:wne="http://schemas.microsoft.com/office/word/2006/wordml" xmlns:wps="http://schemas.microsoft.com/office/word/2010/wordprocessingShape" mc:Ignorable="w14 w15 w16se w16cid wp14">
   <w:footnote w:type="separator" w:id="-1">
     <w:p>
       <w:pPr>
@@ -1017,8 +1439,562 @@
 </w:footnotes>
 </file>
 
+<file path=word/numbering.xml><?xml version="1.0" encoding="utf-8"?>
+<w:numbering xmlns:wpc="http://schemas.microsoft.com/office/word/2010/wordprocessingCanvas" xmlns:cx="http://schemas.microsoft.com/office/drawing/2014/chartex" xmlns:cx1="http://schemas.microsoft.com/office/drawing/2015/9/8/chartex" xmlns:cx2="http://schemas.microsoft.com/office/drawing/2015/10/21/chartex" xmlns:cx3="http://schemas.microsoft.com/office/drawing/2016/5/9/chartex" xmlns:cx4="http://schemas.microsoft.com/office/drawing/2016/5/10/chartex" xmlns:cx5="http://schemas.microsoft.com/office/drawing/2016/5/11/chartex" xmlns:cx6="http://schemas.microsoft.com/office/drawing/2016/5/12/chartex" xmlns:cx7="http://schemas.microsoft.com/office/drawing/2016/5/13/chartex" xmlns:cx8="http://schemas.microsoft.com/office/drawing/2016/5/14/chartex" xmlns:mc="http://schemas.openxmlformats.org/markup-compatibility/2006" xmlns:aink="http://schemas.microsoft.com/office/drawing/2016/ink" xmlns:am3d="http://schemas.microsoft.com/office/drawing/2017/model3d" xmlns:o="urn:schemas-microsoft-com:office:office" xmlns:r="http://schemas.openxmlformats.org/officeDocument/2006/relationships" xmlns:m="http://schemas.openxmlformats.org/officeDocument/2006/math" xmlns:v="urn:schemas-microsoft-com:vml" xmlns:wp14="http://schemas.microsoft.com/office/word/2010/wordprocessingDrawing" xmlns:wp="http://schemas.openxmlformats.org/drawingml/2006/wordprocessingDrawing" xmlns:w10="urn:schemas-microsoft-com:office:word" xmlns:w="http://schemas.openxmlformats.org/wordprocessingml/2006/main" xmlns:w14="http://schemas.microsoft.com/office/word/2010/wordml" xmlns:w15="http://schemas.microsoft.com/office/word/2012/wordml" xmlns:w16cid="http://schemas.microsoft.com/office/word/2016/wordml/cid" xmlns:w16se="http://schemas.microsoft.com/office/word/2015/wordml/symex" xmlns:wpg="http://schemas.microsoft.com/office/word/2010/wordprocessingGroup" xmlns:wpi="http://schemas.microsoft.com/office/word/2010/wordprocessingInk" xmlns:wne="http://schemas.microsoft.com/office/word/2006/wordml" xmlns:wps="http://schemas.microsoft.com/office/word/2010/wordprocessingShape" mc:Ignorable="w14 w15 w16se w16cid wp14">
+  <w:abstractNum w:abstractNumId="0" w15:restartNumberingAfterBreak="0">
+    <w:nsid w:val="18397EAF"/>
+    <w:multiLevelType w:val="hybridMultilevel"/>
+    <w:tmpl w:val="33E07726"/>
+    <w:lvl w:ilvl="0" w:tplc="3D1013BA">
+      <w:start w:val="2"/>
+      <w:numFmt w:val="decimal"/>
+      <w:lvlText w:val="%1-"/>
+      <w:lvlJc w:val="left"/>
+      <w:pPr>
+        <w:ind w:left="720" w:hanging="360"/>
+      </w:pPr>
+      <w:rPr>
+        <w:rFonts w:hint="default"/>
+      </w:rPr>
+    </w:lvl>
+    <w:lvl w:ilvl="1" w:tplc="04160019" w:tentative="1">
+      <w:start w:val="1"/>
+      <w:numFmt w:val="lowerLetter"/>
+      <w:lvlText w:val="%2."/>
+      <w:lvlJc w:val="left"/>
+      <w:pPr>
+        <w:ind w:left="1440" w:hanging="360"/>
+      </w:pPr>
+    </w:lvl>
+    <w:lvl w:ilvl="2" w:tplc="0416001B" w:tentative="1">
+      <w:start w:val="1"/>
+      <w:numFmt w:val="lowerRoman"/>
+      <w:lvlText w:val="%3."/>
+      <w:lvlJc w:val="right"/>
+      <w:pPr>
+        <w:ind w:left="2160" w:hanging="180"/>
+      </w:pPr>
+    </w:lvl>
+    <w:lvl w:ilvl="3" w:tplc="0416000F" w:tentative="1">
+      <w:start w:val="1"/>
+      <w:numFmt w:val="decimal"/>
+      <w:lvlText w:val="%4."/>
+      <w:lvlJc w:val="left"/>
+      <w:pPr>
+        <w:ind w:left="2880" w:hanging="360"/>
+      </w:pPr>
+    </w:lvl>
+    <w:lvl w:ilvl="4" w:tplc="04160019" w:tentative="1">
+      <w:start w:val="1"/>
+      <w:numFmt w:val="lowerLetter"/>
+      <w:lvlText w:val="%5."/>
+      <w:lvlJc w:val="left"/>
+      <w:pPr>
+        <w:ind w:left="3600" w:hanging="360"/>
+      </w:pPr>
+    </w:lvl>
+    <w:lvl w:ilvl="5" w:tplc="0416001B" w:tentative="1">
+      <w:start w:val="1"/>
+      <w:numFmt w:val="lowerRoman"/>
+      <w:lvlText w:val="%6."/>
+      <w:lvlJc w:val="right"/>
+      <w:pPr>
+        <w:ind w:left="4320" w:hanging="180"/>
+      </w:pPr>
+    </w:lvl>
+    <w:lvl w:ilvl="6" w:tplc="0416000F" w:tentative="1">
+      <w:start w:val="1"/>
+      <w:numFmt w:val="decimal"/>
+      <w:lvlText w:val="%7."/>
+      <w:lvlJc w:val="left"/>
+      <w:pPr>
+        <w:ind w:left="5040" w:hanging="360"/>
+      </w:pPr>
+    </w:lvl>
+    <w:lvl w:ilvl="7" w:tplc="04160019" w:tentative="1">
+      <w:start w:val="1"/>
+      <w:numFmt w:val="lowerLetter"/>
+      <w:lvlText w:val="%8."/>
+      <w:lvlJc w:val="left"/>
+      <w:pPr>
+        <w:ind w:left="5760" w:hanging="360"/>
+      </w:pPr>
+    </w:lvl>
+    <w:lvl w:ilvl="8" w:tplc="0416001B" w:tentative="1">
+      <w:start w:val="1"/>
+      <w:numFmt w:val="lowerRoman"/>
+      <w:lvlText w:val="%9."/>
+      <w:lvlJc w:val="right"/>
+      <w:pPr>
+        <w:ind w:left="6480" w:hanging="180"/>
+      </w:pPr>
+    </w:lvl>
+  </w:abstractNum>
+  <w:abstractNum w:abstractNumId="1" w15:restartNumberingAfterBreak="0">
+    <w:nsid w:val="4343295A"/>
+    <w:multiLevelType w:val="hybridMultilevel"/>
+    <w:tmpl w:val="F77E23A2"/>
+    <w:lvl w:ilvl="0" w:tplc="B55ABD8A">
+      <w:start w:val="2"/>
+      <w:numFmt w:val="decimalZero"/>
+      <w:lvlText w:val="%1"/>
+      <w:lvlJc w:val="left"/>
+      <w:pPr>
+        <w:ind w:left="720" w:hanging="360"/>
+      </w:pPr>
+      <w:rPr>
+        <w:rFonts w:hint="default"/>
+      </w:rPr>
+    </w:lvl>
+    <w:lvl w:ilvl="1" w:tplc="04160019" w:tentative="1">
+      <w:start w:val="1"/>
+      <w:numFmt w:val="lowerLetter"/>
+      <w:lvlText w:val="%2."/>
+      <w:lvlJc w:val="left"/>
+      <w:pPr>
+        <w:ind w:left="1440" w:hanging="360"/>
+      </w:pPr>
+    </w:lvl>
+    <w:lvl w:ilvl="2" w:tplc="0416001B" w:tentative="1">
+      <w:start w:val="1"/>
+      <w:numFmt w:val="lowerRoman"/>
+      <w:lvlText w:val="%3."/>
+      <w:lvlJc w:val="right"/>
+      <w:pPr>
+        <w:ind w:left="2160" w:hanging="180"/>
+      </w:pPr>
+    </w:lvl>
+    <w:lvl w:ilvl="3" w:tplc="0416000F" w:tentative="1">
+      <w:start w:val="1"/>
+      <w:numFmt w:val="decimal"/>
+      <w:lvlText w:val="%4."/>
+      <w:lvlJc w:val="left"/>
+      <w:pPr>
+        <w:ind w:left="2880" w:hanging="360"/>
+      </w:pPr>
+    </w:lvl>
+    <w:lvl w:ilvl="4" w:tplc="04160019" w:tentative="1">
+      <w:start w:val="1"/>
+      <w:numFmt w:val="lowerLetter"/>
+      <w:lvlText w:val="%5."/>
+      <w:lvlJc w:val="left"/>
+      <w:pPr>
+        <w:ind w:left="3600" w:hanging="360"/>
+      </w:pPr>
+    </w:lvl>
+    <w:lvl w:ilvl="5" w:tplc="0416001B" w:tentative="1">
+      <w:start w:val="1"/>
+      <w:numFmt w:val="lowerRoman"/>
+      <w:lvlText w:val="%6."/>
+      <w:lvlJc w:val="right"/>
+      <w:pPr>
+        <w:ind w:left="4320" w:hanging="180"/>
+      </w:pPr>
+    </w:lvl>
+    <w:lvl w:ilvl="6" w:tplc="0416000F" w:tentative="1">
+      <w:start w:val="1"/>
+      <w:numFmt w:val="decimal"/>
+      <w:lvlText w:val="%7."/>
+      <w:lvlJc w:val="left"/>
+      <w:pPr>
+        <w:ind w:left="5040" w:hanging="360"/>
+      </w:pPr>
+    </w:lvl>
+    <w:lvl w:ilvl="7" w:tplc="04160019" w:tentative="1">
+      <w:start w:val="1"/>
+      <w:numFmt w:val="lowerLetter"/>
+      <w:lvlText w:val="%8."/>
+      <w:lvlJc w:val="left"/>
+      <w:pPr>
+        <w:ind w:left="5760" w:hanging="360"/>
+      </w:pPr>
+    </w:lvl>
+    <w:lvl w:ilvl="8" w:tplc="0416001B" w:tentative="1">
+      <w:start w:val="1"/>
+      <w:numFmt w:val="lowerRoman"/>
+      <w:lvlText w:val="%9."/>
+      <w:lvlJc w:val="right"/>
+      <w:pPr>
+        <w:ind w:left="6480" w:hanging="180"/>
+      </w:pPr>
+    </w:lvl>
+  </w:abstractNum>
+  <w:abstractNum w:abstractNumId="2" w15:restartNumberingAfterBreak="0">
+    <w:nsid w:val="45C8B876"/>
+    <w:multiLevelType w:val="hybridMultilevel"/>
+    <w:tmpl w:val="315E73BC"/>
+    <w:lvl w:ilvl="0" w:tplc="7E0ADA2A">
+      <w:start w:val="1"/>
+      <w:numFmt w:val="decimal"/>
+      <w:lvlText w:val="%1-"/>
+      <w:lvlJc w:val="left"/>
+      <w:pPr>
+        <w:ind w:left="720" w:hanging="360"/>
+      </w:pPr>
+    </w:lvl>
+    <w:lvl w:ilvl="1" w:tplc="3444663E">
+      <w:start w:val="1"/>
+      <w:numFmt w:val="lowerLetter"/>
+      <w:lvlText w:val="%2."/>
+      <w:lvlJc w:val="left"/>
+      <w:pPr>
+        <w:ind w:left="1440" w:hanging="360"/>
+      </w:pPr>
+    </w:lvl>
+    <w:lvl w:ilvl="2" w:tplc="B0FA1B14">
+      <w:start w:val="1"/>
+      <w:numFmt w:val="lowerRoman"/>
+      <w:lvlText w:val="%3."/>
+      <w:lvlJc w:val="right"/>
+      <w:pPr>
+        <w:ind w:left="2160" w:hanging="180"/>
+      </w:pPr>
+    </w:lvl>
+    <w:lvl w:ilvl="3" w:tplc="39F4919A">
+      <w:start w:val="1"/>
+      <w:numFmt w:val="decimal"/>
+      <w:lvlText w:val="%4."/>
+      <w:lvlJc w:val="left"/>
+      <w:pPr>
+        <w:ind w:left="2880" w:hanging="360"/>
+      </w:pPr>
+    </w:lvl>
+    <w:lvl w:ilvl="4" w:tplc="620012FE">
+      <w:start w:val="1"/>
+      <w:numFmt w:val="lowerLetter"/>
+      <w:lvlText w:val="%5."/>
+      <w:lvlJc w:val="left"/>
+      <w:pPr>
+        <w:ind w:left="3600" w:hanging="360"/>
+      </w:pPr>
+    </w:lvl>
+    <w:lvl w:ilvl="5" w:tplc="12221E64">
+      <w:start w:val="1"/>
+      <w:numFmt w:val="lowerRoman"/>
+      <w:lvlText w:val="%6."/>
+      <w:lvlJc w:val="right"/>
+      <w:pPr>
+        <w:ind w:left="4320" w:hanging="180"/>
+      </w:pPr>
+    </w:lvl>
+    <w:lvl w:ilvl="6" w:tplc="4F0CF0D8">
+      <w:start w:val="1"/>
+      <w:numFmt w:val="decimal"/>
+      <w:lvlText w:val="%7."/>
+      <w:lvlJc w:val="left"/>
+      <w:pPr>
+        <w:ind w:left="5040" w:hanging="360"/>
+      </w:pPr>
+    </w:lvl>
+    <w:lvl w:ilvl="7" w:tplc="0EE26F4C">
+      <w:start w:val="1"/>
+      <w:numFmt w:val="lowerLetter"/>
+      <w:lvlText w:val="%8."/>
+      <w:lvlJc w:val="left"/>
+      <w:pPr>
+        <w:ind w:left="5760" w:hanging="360"/>
+      </w:pPr>
+    </w:lvl>
+    <w:lvl w:ilvl="8" w:tplc="4DD6787C">
+      <w:start w:val="1"/>
+      <w:numFmt w:val="lowerRoman"/>
+      <w:lvlText w:val="%9."/>
+      <w:lvlJc w:val="right"/>
+      <w:pPr>
+        <w:ind w:left="6480" w:hanging="180"/>
+      </w:pPr>
+    </w:lvl>
+  </w:abstractNum>
+  <w:abstractNum w:abstractNumId="3" w15:restartNumberingAfterBreak="0">
+    <w:nsid w:val="55990E6B"/>
+    <w:multiLevelType w:val="hybridMultilevel"/>
+    <w:tmpl w:val="8584BFE4"/>
+    <w:lvl w:ilvl="0" w:tplc="650E5446">
+      <w:start w:val="1"/>
+      <w:numFmt w:val="decimalZero"/>
+      <w:lvlText w:val="%1-"/>
+      <w:lvlJc w:val="left"/>
+      <w:pPr>
+        <w:ind w:left="720" w:hanging="360"/>
+      </w:pPr>
+      <w:rPr>
+        <w:rFonts w:hint="default"/>
+      </w:rPr>
+    </w:lvl>
+    <w:lvl w:ilvl="1" w:tplc="04160019" w:tentative="1">
+      <w:start w:val="1"/>
+      <w:numFmt w:val="lowerLetter"/>
+      <w:lvlText w:val="%2."/>
+      <w:lvlJc w:val="left"/>
+      <w:pPr>
+        <w:ind w:left="1440" w:hanging="360"/>
+      </w:pPr>
+    </w:lvl>
+    <w:lvl w:ilvl="2" w:tplc="0416001B" w:tentative="1">
+      <w:start w:val="1"/>
+      <w:numFmt w:val="lowerRoman"/>
+      <w:lvlText w:val="%3."/>
+      <w:lvlJc w:val="right"/>
+      <w:pPr>
+        <w:ind w:left="2160" w:hanging="180"/>
+      </w:pPr>
+    </w:lvl>
+    <w:lvl w:ilvl="3" w:tplc="0416000F" w:tentative="1">
+      <w:start w:val="1"/>
+      <w:numFmt w:val="decimal"/>
+      <w:lvlText w:val="%4."/>
+      <w:lvlJc w:val="left"/>
+      <w:pPr>
+        <w:ind w:left="2880" w:hanging="360"/>
+      </w:pPr>
+    </w:lvl>
+    <w:lvl w:ilvl="4" w:tplc="04160019" w:tentative="1">
+      <w:start w:val="1"/>
+      <w:numFmt w:val="lowerLetter"/>
+      <w:lvlText w:val="%5."/>
+      <w:lvlJc w:val="left"/>
+      <w:pPr>
+        <w:ind w:left="3600" w:hanging="360"/>
+      </w:pPr>
+    </w:lvl>
+    <w:lvl w:ilvl="5" w:tplc="0416001B" w:tentative="1">
+      <w:start w:val="1"/>
+      <w:numFmt w:val="lowerRoman"/>
+      <w:lvlText w:val="%6."/>
+      <w:lvlJc w:val="right"/>
+      <w:pPr>
+        <w:ind w:left="4320" w:hanging="180"/>
+      </w:pPr>
+    </w:lvl>
+    <w:lvl w:ilvl="6" w:tplc="0416000F" w:tentative="1">
+      <w:start w:val="1"/>
+      <w:numFmt w:val="decimal"/>
+      <w:lvlText w:val="%7."/>
+      <w:lvlJc w:val="left"/>
+      <w:pPr>
+        <w:ind w:left="5040" w:hanging="360"/>
+      </w:pPr>
+    </w:lvl>
+    <w:lvl w:ilvl="7" w:tplc="04160019" w:tentative="1">
+      <w:start w:val="1"/>
+      <w:numFmt w:val="lowerLetter"/>
+      <w:lvlText w:val="%8."/>
+      <w:lvlJc w:val="left"/>
+      <w:pPr>
+        <w:ind w:left="5760" w:hanging="360"/>
+      </w:pPr>
+    </w:lvl>
+    <w:lvl w:ilvl="8" w:tplc="0416001B" w:tentative="1">
+      <w:start w:val="1"/>
+      <w:numFmt w:val="lowerRoman"/>
+      <w:lvlText w:val="%9."/>
+      <w:lvlJc w:val="right"/>
+      <w:pPr>
+        <w:ind w:left="6480" w:hanging="180"/>
+      </w:pPr>
+    </w:lvl>
+  </w:abstractNum>
+  <w:abstractNum w:abstractNumId="4" w15:restartNumberingAfterBreak="0">
+    <w:nsid w:val="5C2A13BC"/>
+    <w:multiLevelType w:val="hybridMultilevel"/>
+    <w:tmpl w:val="2C5875E8"/>
+    <w:lvl w:ilvl="0" w:tplc="3D2AFBD2">
+      <w:start w:val="2"/>
+      <w:numFmt w:val="decimalZero"/>
+      <w:lvlText w:val="%1"/>
+      <w:lvlJc w:val="left"/>
+      <w:pPr>
+        <w:ind w:left="460" w:hanging="360"/>
+      </w:pPr>
+      <w:rPr>
+        <w:rFonts w:hint="default"/>
+      </w:rPr>
+    </w:lvl>
+    <w:lvl w:ilvl="1" w:tplc="04160019" w:tentative="1">
+      <w:start w:val="1"/>
+      <w:numFmt w:val="lowerLetter"/>
+      <w:lvlText w:val="%2."/>
+      <w:lvlJc w:val="left"/>
+      <w:pPr>
+        <w:ind w:left="1180" w:hanging="360"/>
+      </w:pPr>
+    </w:lvl>
+    <w:lvl w:ilvl="2" w:tplc="0416001B" w:tentative="1">
+      <w:start w:val="1"/>
+      <w:numFmt w:val="lowerRoman"/>
+      <w:lvlText w:val="%3."/>
+      <w:lvlJc w:val="right"/>
+      <w:pPr>
+        <w:ind w:left="1900" w:hanging="180"/>
+      </w:pPr>
+    </w:lvl>
+    <w:lvl w:ilvl="3" w:tplc="0416000F" w:tentative="1">
+      <w:start w:val="1"/>
+      <w:numFmt w:val="decimal"/>
+      <w:lvlText w:val="%4."/>
+      <w:lvlJc w:val="left"/>
+      <w:pPr>
+        <w:ind w:left="2620" w:hanging="360"/>
+      </w:pPr>
+    </w:lvl>
+    <w:lvl w:ilvl="4" w:tplc="04160019" w:tentative="1">
+      <w:start w:val="1"/>
+      <w:numFmt w:val="lowerLetter"/>
+      <w:lvlText w:val="%5."/>
+      <w:lvlJc w:val="left"/>
+      <w:pPr>
+        <w:ind w:left="3340" w:hanging="360"/>
+      </w:pPr>
+    </w:lvl>
+    <w:lvl w:ilvl="5" w:tplc="0416001B" w:tentative="1">
+      <w:start w:val="1"/>
+      <w:numFmt w:val="lowerRoman"/>
+      <w:lvlText w:val="%6."/>
+      <w:lvlJc w:val="right"/>
+      <w:pPr>
+        <w:ind w:left="4060" w:hanging="180"/>
+      </w:pPr>
+    </w:lvl>
+    <w:lvl w:ilvl="6" w:tplc="0416000F" w:tentative="1">
+      <w:start w:val="1"/>
+      <w:numFmt w:val="decimal"/>
+      <w:lvlText w:val="%7."/>
+      <w:lvlJc w:val="left"/>
+      <w:pPr>
+        <w:ind w:left="4780" w:hanging="360"/>
+      </w:pPr>
+    </w:lvl>
+    <w:lvl w:ilvl="7" w:tplc="04160019" w:tentative="1">
+      <w:start w:val="1"/>
+      <w:numFmt w:val="lowerLetter"/>
+      <w:lvlText w:val="%8."/>
+      <w:lvlJc w:val="left"/>
+      <w:pPr>
+        <w:ind w:left="5500" w:hanging="360"/>
+      </w:pPr>
+    </w:lvl>
+    <w:lvl w:ilvl="8" w:tplc="0416001B" w:tentative="1">
+      <w:start w:val="1"/>
+      <w:numFmt w:val="lowerRoman"/>
+      <w:lvlText w:val="%9."/>
+      <w:lvlJc w:val="right"/>
+      <w:pPr>
+        <w:ind w:left="6220" w:hanging="180"/>
+      </w:pPr>
+    </w:lvl>
+  </w:abstractNum>
+  <w:abstractNum w:abstractNumId="5" w15:restartNumberingAfterBreak="0">
+    <w:nsid w:val="6527659A"/>
+    <w:multiLevelType w:val="hybridMultilevel"/>
+    <w:tmpl w:val="3BFEF4EC"/>
+    <w:lvl w:ilvl="0" w:tplc="F820698A">
+      <w:start w:val="2"/>
+      <w:numFmt w:val="decimalZero"/>
+      <w:lvlText w:val="%1-"/>
+      <w:lvlJc w:val="left"/>
+      <w:pPr>
+        <w:ind w:left="820" w:hanging="360"/>
+      </w:pPr>
+      <w:rPr>
+        <w:rFonts w:hint="default"/>
+      </w:rPr>
+    </w:lvl>
+    <w:lvl w:ilvl="1" w:tplc="04160019" w:tentative="1">
+      <w:start w:val="1"/>
+      <w:numFmt w:val="lowerLetter"/>
+      <w:lvlText w:val="%2."/>
+      <w:lvlJc w:val="left"/>
+      <w:pPr>
+        <w:ind w:left="1540" w:hanging="360"/>
+      </w:pPr>
+    </w:lvl>
+    <w:lvl w:ilvl="2" w:tplc="0416001B" w:tentative="1">
+      <w:start w:val="1"/>
+      <w:numFmt w:val="lowerRoman"/>
+      <w:lvlText w:val="%3."/>
+      <w:lvlJc w:val="right"/>
+      <w:pPr>
+        <w:ind w:left="2260" w:hanging="180"/>
+      </w:pPr>
+    </w:lvl>
+    <w:lvl w:ilvl="3" w:tplc="0416000F" w:tentative="1">
+      <w:start w:val="1"/>
+      <w:numFmt w:val="decimal"/>
+      <w:lvlText w:val="%4."/>
+      <w:lvlJc w:val="left"/>
+      <w:pPr>
+        <w:ind w:left="2980" w:hanging="360"/>
+      </w:pPr>
+    </w:lvl>
+    <w:lvl w:ilvl="4" w:tplc="04160019" w:tentative="1">
+      <w:start w:val="1"/>
+      <w:numFmt w:val="lowerLetter"/>
+      <w:lvlText w:val="%5."/>
+      <w:lvlJc w:val="left"/>
+      <w:pPr>
+        <w:ind w:left="3700" w:hanging="360"/>
+      </w:pPr>
+    </w:lvl>
+    <w:lvl w:ilvl="5" w:tplc="0416001B" w:tentative="1">
+      <w:start w:val="1"/>
+      <w:numFmt w:val="lowerRoman"/>
+      <w:lvlText w:val="%6."/>
+      <w:lvlJc w:val="right"/>
+      <w:pPr>
+        <w:ind w:left="4420" w:hanging="180"/>
+      </w:pPr>
+    </w:lvl>
+    <w:lvl w:ilvl="6" w:tplc="0416000F" w:tentative="1">
+      <w:start w:val="1"/>
+      <w:numFmt w:val="decimal"/>
+      <w:lvlText w:val="%7."/>
+      <w:lvlJc w:val="left"/>
+      <w:pPr>
+        <w:ind w:left="5140" w:hanging="360"/>
+      </w:pPr>
+    </w:lvl>
+    <w:lvl w:ilvl="7" w:tplc="04160019" w:tentative="1">
+      <w:start w:val="1"/>
+      <w:numFmt w:val="lowerLetter"/>
+      <w:lvlText w:val="%8."/>
+      <w:lvlJc w:val="left"/>
+      <w:pPr>
+        <w:ind w:left="5860" w:hanging="360"/>
+      </w:pPr>
+    </w:lvl>
+    <w:lvl w:ilvl="8" w:tplc="0416001B" w:tentative="1">
+      <w:start w:val="1"/>
+      <w:numFmt w:val="lowerRoman"/>
+      <w:lvlText w:val="%9."/>
+      <w:lvlJc w:val="right"/>
+      <w:pPr>
+        <w:ind w:left="6580" w:hanging="180"/>
+      </w:pPr>
+    </w:lvl>
+  </w:abstractNum>
+  <w:num w:numId="1">
+    <w:abstractNumId w:val="3"/>
+  </w:num>
+  <w:num w:numId="2">
+    <w:abstractNumId w:val="1"/>
+  </w:num>
+  <w:num w:numId="3">
+    <w:abstractNumId w:val="4"/>
+  </w:num>
+  <w:num w:numId="4">
+    <w:abstractNumId w:val="5"/>
+  </w:num>
+  <w:num w:numId="5">
+    <w:abstractNumId w:val="2"/>
+  </w:num>
+  <w:num w:numId="6">
+    <w:abstractNumId w:val="0"/>
+  </w:num>
+</w:numbering>
+</file>
+
 <file path=word/styles.xml><?xml version="1.0" encoding="utf-8"?>
-<w:styles xmlns:mc="http://schemas.openxmlformats.org/markup-compatibility/2006" xmlns:r="http://schemas.openxmlformats.org/officeDocument/2006/relationships" xmlns:w="http://schemas.openxmlformats.org/wordprocessingml/2006/main" xmlns:w14="http://schemas.microsoft.com/office/word/2010/wordml" xmlns:w15="http://schemas.microsoft.com/office/word/2012/wordml" xmlns:w16cex="http://schemas.microsoft.com/office/word/2018/wordml/cex" xmlns:w16cid="http://schemas.microsoft.com/office/word/2016/wordml/cid" xmlns:w16="http://schemas.microsoft.com/office/word/2018/wordml" xmlns:w16du="http://schemas.microsoft.com/office/word/2023/wordml/word16du" xmlns:w16sdtdh="http://schemas.microsoft.com/office/word/2020/wordml/sdtdatahash" xmlns:w16sdtfl="http://schemas.microsoft.com/office/word/2024/wordml/sdtformatlock" xmlns:w16se="http://schemas.microsoft.com/office/word/2015/wordml/symex" mc:Ignorable="w14 w15 w16se w16cid w16 w16cex w16sdtdh w16sdtfl w16du">
+<w:styles xmlns:mc="http://schemas.openxmlformats.org/markup-compatibility/2006" xmlns:r="http://schemas.openxmlformats.org/officeDocument/2006/relationships" xmlns:w="http://schemas.openxmlformats.org/wordprocessingml/2006/main" xmlns:w14="http://schemas.microsoft.com/office/word/2010/wordml" xmlns:w15="http://schemas.microsoft.com/office/word/2012/wordml" xmlns:w16cid="http://schemas.microsoft.com/office/word/2016/wordml/cid" xmlns:w16se="http://schemas.microsoft.com/office/word/2015/wordml/symex" mc:Ignorable="w14 w15 w16se w16cid">
   <w:docDefaults>
     <w:rPrDefault>
       <w:rPr>
@@ -1036,7 +2012,7 @@
       </w:pPr>
     </w:pPrDefault>
   </w:docDefaults>
-  <w:latentStyles w:defLockedState="0" w:defUIPriority="99" w:defSemiHidden="0" w:defUnhideWhenUsed="0" w:defQFormat="0" w:count="376">
+  <w:latentStyles w:defLockedState="0" w:defUIPriority="99" w:defSemiHidden="0" w:defUnhideWhenUsed="0" w:defQFormat="0" w:count="375">
     <w:lsdException w:name="Normal" w:uiPriority="0" w:qFormat="1"/>
     <w:lsdException w:name="heading 1" w:uiPriority="9" w:qFormat="1"/>
     <w:lsdException w:name="heading 2" w:semiHidden="1" w:uiPriority="9" w:unhideWhenUsed="1" w:qFormat="1"/>
@@ -1412,7 +2388,6 @@
     <w:lsdException w:name="Smart Hyperlink" w:semiHidden="1" w:unhideWhenUsed="1"/>
     <w:lsdException w:name="Hashtag" w:semiHidden="1" w:unhideWhenUsed="1"/>
     <w:lsdException w:name="Unresolved Mention" w:semiHidden="1" w:unhideWhenUsed="1"/>
-    <w:lsdException w:name="Smart Link" w:semiHidden="1" w:unhideWhenUsed="1"/>
   </w:latentStyles>
   <w:style w:type="paragraph" w:default="1" w:styleId="Normal">
     <w:name w:val="Normal"/>

</xml_diff>

<commit_message>
:books: Documentação Sprint 01 Task 003 Analisar e modificar (se necessário) a parte de Lista de Caso de Uso
</commit_message>
<xml_diff>
--- a/documentation/template/Sprint Documentation atualizada.docx
+++ b/documentation/template/Sprint Documentation atualizada.docx
@@ -1,6 +1,6 @@
 
 <file path=word/document.xml><?xml version="1.0" encoding="utf-8"?>
-<w:document xmlns:wpc="http://schemas.microsoft.com/office/word/2010/wordprocessingCanvas" xmlns:cx="http://schemas.microsoft.com/office/drawing/2014/chartex" xmlns:cx1="http://schemas.microsoft.com/office/drawing/2015/9/8/chartex" xmlns:cx2="http://schemas.microsoft.com/office/drawing/2015/10/21/chartex" xmlns:cx3="http://schemas.microsoft.com/office/drawing/2016/5/9/chartex" xmlns:cx4="http://schemas.microsoft.com/office/drawing/2016/5/10/chartex" xmlns:cx5="http://schemas.microsoft.com/office/drawing/2016/5/11/chartex" xmlns:cx6="http://schemas.microsoft.com/office/drawing/2016/5/12/chartex" xmlns:cx7="http://schemas.microsoft.com/office/drawing/2016/5/13/chartex" xmlns:cx8="http://schemas.microsoft.com/office/drawing/2016/5/14/chartex" xmlns:mc="http://schemas.openxmlformats.org/markup-compatibility/2006" xmlns:aink="http://schemas.microsoft.com/office/drawing/2016/ink" xmlns:am3d="http://schemas.microsoft.com/office/drawing/2017/model3d" xmlns:o="urn:schemas-microsoft-com:office:office" xmlns:oel="http://schemas.microsoft.com/office/2019/extlst" xmlns:r="http://schemas.openxmlformats.org/officeDocument/2006/relationships" xmlns:m="http://schemas.openxmlformats.org/officeDocument/2006/math" xmlns:v="urn:schemas-microsoft-com:vml" xmlns:wp14="http://schemas.microsoft.com/office/word/2010/wordprocessingDrawing" xmlns:wp="http://schemas.openxmlformats.org/drawingml/2006/wordprocessingDrawing" xmlns:w10="urn:schemas-microsoft-com:office:word" xmlns:w="http://schemas.openxmlformats.org/wordprocessingml/2006/main" xmlns:w14="http://schemas.microsoft.com/office/word/2010/wordml" xmlns:w15="http://schemas.microsoft.com/office/word/2012/wordml" xmlns:w16cex="http://schemas.microsoft.com/office/word/2018/wordml/cex" xmlns:w16cid="http://schemas.microsoft.com/office/word/2016/wordml/cid" xmlns:w16="http://schemas.microsoft.com/office/word/2018/wordml" xmlns:w16du="http://schemas.microsoft.com/office/word/2023/wordml/word16du" xmlns:w16sdtdh="http://schemas.microsoft.com/office/word/2020/wordml/sdtdatahash" xmlns:w16sdtfl="http://schemas.microsoft.com/office/word/2024/wordml/sdtformatlock" xmlns:w16se="http://schemas.microsoft.com/office/word/2015/wordml/symex" xmlns:wpg="http://schemas.microsoft.com/office/word/2010/wordprocessingGroup" xmlns:wpi="http://schemas.microsoft.com/office/word/2010/wordprocessingInk" xmlns:wne="http://schemas.microsoft.com/office/word/2006/wordml" xmlns:wps="http://schemas.microsoft.com/office/word/2010/wordprocessingShape" mc:Ignorable="w14 w15 w16se w16cid w16 w16cex w16sdtdh w16sdtfl w16du wp14">
+<w:document xmlns:wpc="http://schemas.microsoft.com/office/word/2010/wordprocessingCanvas" xmlns:cx="http://schemas.microsoft.com/office/drawing/2014/chartex" xmlns:cx1="http://schemas.microsoft.com/office/drawing/2015/9/8/chartex" xmlns:cx2="http://schemas.microsoft.com/office/drawing/2015/10/21/chartex" xmlns:cx3="http://schemas.microsoft.com/office/drawing/2016/5/9/chartex" xmlns:cx4="http://schemas.microsoft.com/office/drawing/2016/5/10/chartex" xmlns:cx5="http://schemas.microsoft.com/office/drawing/2016/5/11/chartex" xmlns:cx6="http://schemas.microsoft.com/office/drawing/2016/5/12/chartex" xmlns:cx7="http://schemas.microsoft.com/office/drawing/2016/5/13/chartex" xmlns:cx8="http://schemas.microsoft.com/office/drawing/2016/5/14/chartex" xmlns:mc="http://schemas.openxmlformats.org/markup-compatibility/2006" xmlns:aink="http://schemas.microsoft.com/office/drawing/2016/ink" xmlns:am3d="http://schemas.microsoft.com/office/drawing/2017/model3d" xmlns:o="urn:schemas-microsoft-com:office:office" xmlns:r="http://schemas.openxmlformats.org/officeDocument/2006/relationships" xmlns:m="http://schemas.openxmlformats.org/officeDocument/2006/math" xmlns:v="urn:schemas-microsoft-com:vml" xmlns:wp14="http://schemas.microsoft.com/office/word/2010/wordprocessingDrawing" xmlns:wp="http://schemas.openxmlformats.org/drawingml/2006/wordprocessingDrawing" xmlns:w10="urn:schemas-microsoft-com:office:word" xmlns:w="http://schemas.openxmlformats.org/wordprocessingml/2006/main" xmlns:w14="http://schemas.microsoft.com/office/word/2010/wordml" xmlns:w15="http://schemas.microsoft.com/office/word/2012/wordml" xmlns:w16cid="http://schemas.microsoft.com/office/word/2016/wordml/cid" xmlns:w16se="http://schemas.microsoft.com/office/word/2015/wordml/symex" xmlns:wpg="http://schemas.microsoft.com/office/word/2010/wordprocessingGroup" xmlns:wpi="http://schemas.microsoft.com/office/word/2010/wordprocessingInk" xmlns:wne="http://schemas.microsoft.com/office/word/2006/wordml" xmlns:wps="http://schemas.microsoft.com/office/word/2010/wordprocessingShape" mc:Ignorable="w14 w15 w16se w16cid wp14">
   <w:body>
     <w:p>
       <w:pPr>
@@ -436,9 +436,11 @@
             <w:tcW w:w="1541" w:type="dxa"/>
           </w:tcPr>
           <w:p>
+            <w:proofErr w:type="gramStart"/>
             <w:r>
               <w:t>Start Date</w:t>
             </w:r>
+            <w:proofErr w:type="gramEnd"/>
           </w:p>
         </w:tc>
         <w:tc>
@@ -587,12 +589,21 @@
                 <w:bCs/>
               </w:rPr>
             </w:pPr>
-            <w:r>
-              <w:rPr>
-                <w:b/>
-                <w:bCs/>
-              </w:rPr>
-              <w:t xml:space="preserve">Task </w:t>
+            <w:proofErr w:type="spellStart"/>
+            <w:r>
+              <w:rPr>
+                <w:b/>
+                <w:bCs/>
+              </w:rPr>
+              <w:t>Task</w:t>
+            </w:r>
+            <w:proofErr w:type="spellEnd"/>
+            <w:r>
+              <w:rPr>
+                <w:b/>
+                <w:bCs/>
+              </w:rPr>
+              <w:t xml:space="preserve"> </w:t>
             </w:r>
             <w:proofErr w:type="spellStart"/>
             <w:r>
@@ -921,8 +932,13 @@
     </w:p>
     <w:p>
       <w:r>
-        <w:t>Colocar imagens das telas produzidas.</w:t>
+        <w:t>Colocar imagens das telas produzidas</w:t>
       </w:r>
+      <w:r>
+        <w:t>.</w:t>
+      </w:r>
+      <w:bookmarkStart w:id="0" w:name="_GoBack"/>
+      <w:bookmarkEnd w:id="0"/>
     </w:p>
     <w:p>
       <w:r>
@@ -968,7 +984,7 @@
 </file>
 
 <file path=word/endnotes.xml><?xml version="1.0" encoding="utf-8"?>
-<w:endnotes xmlns:wpc="http://schemas.microsoft.com/office/word/2010/wordprocessingCanvas" xmlns:cx="http://schemas.microsoft.com/office/drawing/2014/chartex" xmlns:cx1="http://schemas.microsoft.com/office/drawing/2015/9/8/chartex" xmlns:cx2="http://schemas.microsoft.com/office/drawing/2015/10/21/chartex" xmlns:cx3="http://schemas.microsoft.com/office/drawing/2016/5/9/chartex" xmlns:cx4="http://schemas.microsoft.com/office/drawing/2016/5/10/chartex" xmlns:cx5="http://schemas.microsoft.com/office/drawing/2016/5/11/chartex" xmlns:cx6="http://schemas.microsoft.com/office/drawing/2016/5/12/chartex" xmlns:cx7="http://schemas.microsoft.com/office/drawing/2016/5/13/chartex" xmlns:cx8="http://schemas.microsoft.com/office/drawing/2016/5/14/chartex" xmlns:mc="http://schemas.openxmlformats.org/markup-compatibility/2006" xmlns:aink="http://schemas.microsoft.com/office/drawing/2016/ink" xmlns:am3d="http://schemas.microsoft.com/office/drawing/2017/model3d" xmlns:o="urn:schemas-microsoft-com:office:office" xmlns:oel="http://schemas.microsoft.com/office/2019/extlst" xmlns:r="http://schemas.openxmlformats.org/officeDocument/2006/relationships" xmlns:m="http://schemas.openxmlformats.org/officeDocument/2006/math" xmlns:v="urn:schemas-microsoft-com:vml" xmlns:wp14="http://schemas.microsoft.com/office/word/2010/wordprocessingDrawing" xmlns:wp="http://schemas.openxmlformats.org/drawingml/2006/wordprocessingDrawing" xmlns:w10="urn:schemas-microsoft-com:office:word" xmlns:w="http://schemas.openxmlformats.org/wordprocessingml/2006/main" xmlns:w14="http://schemas.microsoft.com/office/word/2010/wordml" xmlns:w15="http://schemas.microsoft.com/office/word/2012/wordml" xmlns:w16cex="http://schemas.microsoft.com/office/word/2018/wordml/cex" xmlns:w16cid="http://schemas.microsoft.com/office/word/2016/wordml/cid" xmlns:w16="http://schemas.microsoft.com/office/word/2018/wordml" xmlns:w16du="http://schemas.microsoft.com/office/word/2023/wordml/word16du" xmlns:w16sdtdh="http://schemas.microsoft.com/office/word/2020/wordml/sdtdatahash" xmlns:w16sdtfl="http://schemas.microsoft.com/office/word/2024/wordml/sdtformatlock" xmlns:w16se="http://schemas.microsoft.com/office/word/2015/wordml/symex" xmlns:wpg="http://schemas.microsoft.com/office/word/2010/wordprocessingGroup" xmlns:wpi="http://schemas.microsoft.com/office/word/2010/wordprocessingInk" xmlns:wne="http://schemas.microsoft.com/office/word/2006/wordml" xmlns:wps="http://schemas.microsoft.com/office/word/2010/wordprocessingShape" mc:Ignorable="w14 w15 w16se w16cid w16 w16cex w16sdtdh w16sdtfl w16du wp14">
+<w:endnotes xmlns:wpc="http://schemas.microsoft.com/office/word/2010/wordprocessingCanvas" xmlns:cx="http://schemas.microsoft.com/office/drawing/2014/chartex" xmlns:cx1="http://schemas.microsoft.com/office/drawing/2015/9/8/chartex" xmlns:cx2="http://schemas.microsoft.com/office/drawing/2015/10/21/chartex" xmlns:cx3="http://schemas.microsoft.com/office/drawing/2016/5/9/chartex" xmlns:cx4="http://schemas.microsoft.com/office/drawing/2016/5/10/chartex" xmlns:cx5="http://schemas.microsoft.com/office/drawing/2016/5/11/chartex" xmlns:cx6="http://schemas.microsoft.com/office/drawing/2016/5/12/chartex" xmlns:cx7="http://schemas.microsoft.com/office/drawing/2016/5/13/chartex" xmlns:cx8="http://schemas.microsoft.com/office/drawing/2016/5/14/chartex" xmlns:mc="http://schemas.openxmlformats.org/markup-compatibility/2006" xmlns:aink="http://schemas.microsoft.com/office/drawing/2016/ink" xmlns:am3d="http://schemas.microsoft.com/office/drawing/2017/model3d" xmlns:o="urn:schemas-microsoft-com:office:office" xmlns:r="http://schemas.openxmlformats.org/officeDocument/2006/relationships" xmlns:m="http://schemas.openxmlformats.org/officeDocument/2006/math" xmlns:v="urn:schemas-microsoft-com:vml" xmlns:wp14="http://schemas.microsoft.com/office/word/2010/wordprocessingDrawing" xmlns:wp="http://schemas.openxmlformats.org/drawingml/2006/wordprocessingDrawing" xmlns:w10="urn:schemas-microsoft-com:office:word" xmlns:w="http://schemas.openxmlformats.org/wordprocessingml/2006/main" xmlns:w14="http://schemas.microsoft.com/office/word/2010/wordml" xmlns:w15="http://schemas.microsoft.com/office/word/2012/wordml" xmlns:w16cid="http://schemas.microsoft.com/office/word/2016/wordml/cid" xmlns:w16se="http://schemas.microsoft.com/office/word/2015/wordml/symex" xmlns:wpg="http://schemas.microsoft.com/office/word/2010/wordprocessingGroup" xmlns:wpi="http://schemas.microsoft.com/office/word/2010/wordprocessingInk" xmlns:wne="http://schemas.microsoft.com/office/word/2006/wordml" xmlns:wps="http://schemas.microsoft.com/office/word/2010/wordprocessingShape" mc:Ignorable="w14 w15 w16se w16cid wp14">
   <w:endnote w:type="separator" w:id="-1">
     <w:p>
       <w:pPr>
@@ -993,7 +1009,7 @@
 </file>
 
 <file path=word/footnotes.xml><?xml version="1.0" encoding="utf-8"?>
-<w:footnotes xmlns:wpc="http://schemas.microsoft.com/office/word/2010/wordprocessingCanvas" xmlns:cx="http://schemas.microsoft.com/office/drawing/2014/chartex" xmlns:cx1="http://schemas.microsoft.com/office/drawing/2015/9/8/chartex" xmlns:cx2="http://schemas.microsoft.com/office/drawing/2015/10/21/chartex" xmlns:cx3="http://schemas.microsoft.com/office/drawing/2016/5/9/chartex" xmlns:cx4="http://schemas.microsoft.com/office/drawing/2016/5/10/chartex" xmlns:cx5="http://schemas.microsoft.com/office/drawing/2016/5/11/chartex" xmlns:cx6="http://schemas.microsoft.com/office/drawing/2016/5/12/chartex" xmlns:cx7="http://schemas.microsoft.com/office/drawing/2016/5/13/chartex" xmlns:cx8="http://schemas.microsoft.com/office/drawing/2016/5/14/chartex" xmlns:mc="http://schemas.openxmlformats.org/markup-compatibility/2006" xmlns:aink="http://schemas.microsoft.com/office/drawing/2016/ink" xmlns:am3d="http://schemas.microsoft.com/office/drawing/2017/model3d" xmlns:o="urn:schemas-microsoft-com:office:office" xmlns:oel="http://schemas.microsoft.com/office/2019/extlst" xmlns:r="http://schemas.openxmlformats.org/officeDocument/2006/relationships" xmlns:m="http://schemas.openxmlformats.org/officeDocument/2006/math" xmlns:v="urn:schemas-microsoft-com:vml" xmlns:wp14="http://schemas.microsoft.com/office/word/2010/wordprocessingDrawing" xmlns:wp="http://schemas.openxmlformats.org/drawingml/2006/wordprocessingDrawing" xmlns:w10="urn:schemas-microsoft-com:office:word" xmlns:w="http://schemas.openxmlformats.org/wordprocessingml/2006/main" xmlns:w14="http://schemas.microsoft.com/office/word/2010/wordml" xmlns:w15="http://schemas.microsoft.com/office/word/2012/wordml" xmlns:w16cex="http://schemas.microsoft.com/office/word/2018/wordml/cex" xmlns:w16cid="http://schemas.microsoft.com/office/word/2016/wordml/cid" xmlns:w16="http://schemas.microsoft.com/office/word/2018/wordml" xmlns:w16du="http://schemas.microsoft.com/office/word/2023/wordml/word16du" xmlns:w16sdtdh="http://schemas.microsoft.com/office/word/2020/wordml/sdtdatahash" xmlns:w16sdtfl="http://schemas.microsoft.com/office/word/2024/wordml/sdtformatlock" xmlns:w16se="http://schemas.microsoft.com/office/word/2015/wordml/symex" xmlns:wpg="http://schemas.microsoft.com/office/word/2010/wordprocessingGroup" xmlns:wpi="http://schemas.microsoft.com/office/word/2010/wordprocessingInk" xmlns:wne="http://schemas.microsoft.com/office/word/2006/wordml" xmlns:wps="http://schemas.microsoft.com/office/word/2010/wordprocessingShape" mc:Ignorable="w14 w15 w16se w16cid w16 w16cex w16sdtdh w16sdtfl w16du wp14">
+<w:footnotes xmlns:wpc="http://schemas.microsoft.com/office/word/2010/wordprocessingCanvas" xmlns:cx="http://schemas.microsoft.com/office/drawing/2014/chartex" xmlns:cx1="http://schemas.microsoft.com/office/drawing/2015/9/8/chartex" xmlns:cx2="http://schemas.microsoft.com/office/drawing/2015/10/21/chartex" xmlns:cx3="http://schemas.microsoft.com/office/drawing/2016/5/9/chartex" xmlns:cx4="http://schemas.microsoft.com/office/drawing/2016/5/10/chartex" xmlns:cx5="http://schemas.microsoft.com/office/drawing/2016/5/11/chartex" xmlns:cx6="http://schemas.microsoft.com/office/drawing/2016/5/12/chartex" xmlns:cx7="http://schemas.microsoft.com/office/drawing/2016/5/13/chartex" xmlns:cx8="http://schemas.microsoft.com/office/drawing/2016/5/14/chartex" xmlns:mc="http://schemas.openxmlformats.org/markup-compatibility/2006" xmlns:aink="http://schemas.microsoft.com/office/drawing/2016/ink" xmlns:am3d="http://schemas.microsoft.com/office/drawing/2017/model3d" xmlns:o="urn:schemas-microsoft-com:office:office" xmlns:r="http://schemas.openxmlformats.org/officeDocument/2006/relationships" xmlns:m="http://schemas.openxmlformats.org/officeDocument/2006/math" xmlns:v="urn:schemas-microsoft-com:vml" xmlns:wp14="http://schemas.microsoft.com/office/word/2010/wordprocessingDrawing" xmlns:wp="http://schemas.openxmlformats.org/drawingml/2006/wordprocessingDrawing" xmlns:w10="urn:schemas-microsoft-com:office:word" xmlns:w="http://schemas.openxmlformats.org/wordprocessingml/2006/main" xmlns:w14="http://schemas.microsoft.com/office/word/2010/wordml" xmlns:w15="http://schemas.microsoft.com/office/word/2012/wordml" xmlns:w16cid="http://schemas.microsoft.com/office/word/2016/wordml/cid" xmlns:w16se="http://schemas.microsoft.com/office/word/2015/wordml/symex" xmlns:wpg="http://schemas.microsoft.com/office/word/2010/wordprocessingGroup" xmlns:wpi="http://schemas.microsoft.com/office/word/2010/wordprocessingInk" xmlns:wne="http://schemas.microsoft.com/office/word/2006/wordml" xmlns:wps="http://schemas.microsoft.com/office/word/2010/wordprocessingShape" mc:Ignorable="w14 w15 w16se w16cid wp14">
   <w:footnote w:type="separator" w:id="-1">
     <w:p>
       <w:pPr>
@@ -1018,7 +1034,7 @@
 </file>
 
 <file path=word/styles.xml><?xml version="1.0" encoding="utf-8"?>
-<w:styles xmlns:mc="http://schemas.openxmlformats.org/markup-compatibility/2006" xmlns:r="http://schemas.openxmlformats.org/officeDocument/2006/relationships" xmlns:w="http://schemas.openxmlformats.org/wordprocessingml/2006/main" xmlns:w14="http://schemas.microsoft.com/office/word/2010/wordml" xmlns:w15="http://schemas.microsoft.com/office/word/2012/wordml" xmlns:w16cex="http://schemas.microsoft.com/office/word/2018/wordml/cex" xmlns:w16cid="http://schemas.microsoft.com/office/word/2016/wordml/cid" xmlns:w16="http://schemas.microsoft.com/office/word/2018/wordml" xmlns:w16du="http://schemas.microsoft.com/office/word/2023/wordml/word16du" xmlns:w16sdtdh="http://schemas.microsoft.com/office/word/2020/wordml/sdtdatahash" xmlns:w16sdtfl="http://schemas.microsoft.com/office/word/2024/wordml/sdtformatlock" xmlns:w16se="http://schemas.microsoft.com/office/word/2015/wordml/symex" mc:Ignorable="w14 w15 w16se w16cid w16 w16cex w16sdtdh w16sdtfl w16du">
+<w:styles xmlns:mc="http://schemas.openxmlformats.org/markup-compatibility/2006" xmlns:r="http://schemas.openxmlformats.org/officeDocument/2006/relationships" xmlns:w="http://schemas.openxmlformats.org/wordprocessingml/2006/main" xmlns:w14="http://schemas.microsoft.com/office/word/2010/wordml" xmlns:w15="http://schemas.microsoft.com/office/word/2012/wordml" xmlns:w16cid="http://schemas.microsoft.com/office/word/2016/wordml/cid" xmlns:w16se="http://schemas.microsoft.com/office/word/2015/wordml/symex" mc:Ignorable="w14 w15 w16se w16cid">
   <w:docDefaults>
     <w:rPrDefault>
       <w:rPr>
@@ -1036,7 +1052,7 @@
       </w:pPr>
     </w:pPrDefault>
   </w:docDefaults>
-  <w:latentStyles w:defLockedState="0" w:defUIPriority="99" w:defSemiHidden="0" w:defUnhideWhenUsed="0" w:defQFormat="0" w:count="376">
+  <w:latentStyles w:defLockedState="0" w:defUIPriority="99" w:defSemiHidden="0" w:defUnhideWhenUsed="0" w:defQFormat="0" w:count="375">
     <w:lsdException w:name="Normal" w:uiPriority="0" w:qFormat="1"/>
     <w:lsdException w:name="heading 1" w:uiPriority="9" w:qFormat="1"/>
     <w:lsdException w:name="heading 2" w:semiHidden="1" w:uiPriority="9" w:unhideWhenUsed="1" w:qFormat="1"/>
@@ -1412,7 +1428,6 @@
     <w:lsdException w:name="Smart Hyperlink" w:semiHidden="1" w:unhideWhenUsed="1"/>
     <w:lsdException w:name="Hashtag" w:semiHidden="1" w:unhideWhenUsed="1"/>
     <w:lsdException w:name="Unresolved Mention" w:semiHidden="1" w:unhideWhenUsed="1"/>
-    <w:lsdException w:name="Smart Link" w:semiHidden="1" w:unhideWhenUsed="1"/>
   </w:latentStyles>
   <w:style w:type="paragraph" w:default="1" w:styleId="Normal">
     <w:name w:val="Normal"/>

</xml_diff>

<commit_message>
📚 docs: Correção do documento
</commit_message>
<xml_diff>
--- a/documentation/template/Sprint Documentation atualizada.docx
+++ b/documentation/template/Sprint Documentation atualizada.docx
@@ -1,6 +1,6 @@
 
 <file path=word/document.xml><?xml version="1.0" encoding="utf-8"?>
-<w:document xmlns:wpc="http://schemas.microsoft.com/office/word/2010/wordprocessingCanvas" xmlns:cx="http://schemas.microsoft.com/office/drawing/2014/chartex" xmlns:cx1="http://schemas.microsoft.com/office/drawing/2015/9/8/chartex" xmlns:cx2="http://schemas.microsoft.com/office/drawing/2015/10/21/chartex" xmlns:cx3="http://schemas.microsoft.com/office/drawing/2016/5/9/chartex" xmlns:cx4="http://schemas.microsoft.com/office/drawing/2016/5/10/chartex" xmlns:cx5="http://schemas.microsoft.com/office/drawing/2016/5/11/chartex" xmlns:cx6="http://schemas.microsoft.com/office/drawing/2016/5/12/chartex" xmlns:cx7="http://schemas.microsoft.com/office/drawing/2016/5/13/chartex" xmlns:cx8="http://schemas.microsoft.com/office/drawing/2016/5/14/chartex" xmlns:mc="http://schemas.openxmlformats.org/markup-compatibility/2006" xmlns:aink="http://schemas.microsoft.com/office/drawing/2016/ink" xmlns:am3d="http://schemas.microsoft.com/office/drawing/2017/model3d" xmlns:o="urn:schemas-microsoft-com:office:office" xmlns:r="http://schemas.openxmlformats.org/officeDocument/2006/relationships" xmlns:m="http://schemas.openxmlformats.org/officeDocument/2006/math" xmlns:v="urn:schemas-microsoft-com:vml" xmlns:wp14="http://schemas.microsoft.com/office/word/2010/wordprocessingDrawing" xmlns:wp="http://schemas.openxmlformats.org/drawingml/2006/wordprocessingDrawing" xmlns:w10="urn:schemas-microsoft-com:office:word" xmlns:w="http://schemas.openxmlformats.org/wordprocessingml/2006/main" xmlns:w14="http://schemas.microsoft.com/office/word/2010/wordml" xmlns:w15="http://schemas.microsoft.com/office/word/2012/wordml" xmlns:w16cid="http://schemas.microsoft.com/office/word/2016/wordml/cid" xmlns:w16se="http://schemas.microsoft.com/office/word/2015/wordml/symex" xmlns:wpg="http://schemas.microsoft.com/office/word/2010/wordprocessingGroup" xmlns:wpi="http://schemas.microsoft.com/office/word/2010/wordprocessingInk" xmlns:wne="http://schemas.microsoft.com/office/word/2006/wordml" xmlns:wps="http://schemas.microsoft.com/office/word/2010/wordprocessingShape" mc:Ignorable="w14 w15 w16se w16cid wp14">
+<w:document xmlns:wpc="http://schemas.microsoft.com/office/word/2010/wordprocessingCanvas" xmlns:cx="http://schemas.microsoft.com/office/drawing/2014/chartex" xmlns:cx1="http://schemas.microsoft.com/office/drawing/2015/9/8/chartex" xmlns:cx2="http://schemas.microsoft.com/office/drawing/2015/10/21/chartex" xmlns:cx3="http://schemas.microsoft.com/office/drawing/2016/5/9/chartex" xmlns:cx4="http://schemas.microsoft.com/office/drawing/2016/5/10/chartex" xmlns:cx5="http://schemas.microsoft.com/office/drawing/2016/5/11/chartex" xmlns:cx6="http://schemas.microsoft.com/office/drawing/2016/5/12/chartex" xmlns:cx7="http://schemas.microsoft.com/office/drawing/2016/5/13/chartex" xmlns:cx8="http://schemas.microsoft.com/office/drawing/2016/5/14/chartex" xmlns:mc="http://schemas.openxmlformats.org/markup-compatibility/2006" xmlns:aink="http://schemas.microsoft.com/office/drawing/2016/ink" xmlns:am3d="http://schemas.microsoft.com/office/drawing/2017/model3d" xmlns:o="urn:schemas-microsoft-com:office:office" xmlns:oel="http://schemas.microsoft.com/office/2019/extlst" xmlns:r="http://schemas.openxmlformats.org/officeDocument/2006/relationships" xmlns:m="http://schemas.openxmlformats.org/officeDocument/2006/math" xmlns:v="urn:schemas-microsoft-com:vml" xmlns:wp14="http://schemas.microsoft.com/office/word/2010/wordprocessingDrawing" xmlns:wp="http://schemas.openxmlformats.org/drawingml/2006/wordprocessingDrawing" xmlns:w10="urn:schemas-microsoft-com:office:word" xmlns:w="http://schemas.openxmlformats.org/wordprocessingml/2006/main" xmlns:w14="http://schemas.microsoft.com/office/word/2010/wordml" xmlns:w15="http://schemas.microsoft.com/office/word/2012/wordml" xmlns:w16cex="http://schemas.microsoft.com/office/word/2018/wordml/cex" xmlns:w16cid="http://schemas.microsoft.com/office/word/2016/wordml/cid" xmlns:w16="http://schemas.microsoft.com/office/word/2018/wordml" xmlns:w16du="http://schemas.microsoft.com/office/word/2023/wordml/word16du" xmlns:w16sdtdh="http://schemas.microsoft.com/office/word/2020/wordml/sdtdatahash" xmlns:w16sdtfl="http://schemas.microsoft.com/office/word/2024/wordml/sdtformatlock" xmlns:w16se="http://schemas.microsoft.com/office/word/2015/wordml/symex" xmlns:wpg="http://schemas.microsoft.com/office/word/2010/wordprocessingGroup" xmlns:wpi="http://schemas.microsoft.com/office/word/2010/wordprocessingInk" xmlns:wne="http://schemas.microsoft.com/office/word/2006/wordml" xmlns:wps="http://schemas.microsoft.com/office/word/2010/wordprocessingShape" mc:Ignorable="w14 w15 w16se w16cid w16 w16cex w16sdtdh w16sdtfl w16du wp14">
   <w:body>
     <w:p>
       <w:pPr>
@@ -31,7 +31,7 @@
                     </pic:cNvPicPr>
                   </pic:nvPicPr>
                   <pic:blipFill>
-                    <a:blip r:embed="rId7" cstate="print">
+                    <a:blip r:embed="rId6" cstate="print">
                       <a:extLst>
                         <a:ext uri="{28A0092B-C50C-407E-A947-70E740481C1C}">
                           <a14:useLocalDpi xmlns:a14="http://schemas.microsoft.com/office/drawing/2010/main" val="0"/>
@@ -140,13 +140,6 @@
               </w:rPr>
               <w:t>Sprint #</w:t>
             </w:r>
-            <w:r>
-              <w:rPr>
-                <w:b/>
-                <w:bCs/>
-              </w:rPr>
-              <w:t xml:space="preserve"> 1</w:t>
-            </w:r>
           </w:p>
         </w:tc>
         <w:tc>
@@ -167,13 +160,6 @@
               </w:rPr>
               <w:t>Start Date:</w:t>
             </w:r>
-            <w:r>
-              <w:rPr>
-                <w:b/>
-                <w:bCs/>
-              </w:rPr>
-              <w:t xml:space="preserve"> 24/09/2025</w:t>
-            </w:r>
           </w:p>
         </w:tc>
         <w:tc>
@@ -195,13 +181,6 @@
               </w:rPr>
               <w:t>Final Date:</w:t>
             </w:r>
-            <w:r>
-              <w:rPr>
-                <w:b/>
-                <w:bCs/>
-              </w:rPr>
-              <w:t xml:space="preserve"> 29/09/2025</w:t>
-            </w:r>
           </w:p>
         </w:tc>
       </w:tr>
@@ -217,20 +196,15 @@
                 <w:bCs/>
               </w:rPr>
             </w:pPr>
-            <w:r>
-              <w:rPr>
-                <w:b/>
-                <w:bCs/>
-              </w:rPr>
-              <w:t>Proje</w:t>
-            </w:r>
-            <w:r>
-              <w:rPr>
-                <w:b/>
-                <w:bCs/>
-              </w:rPr>
-              <w:t>ct</w:t>
-            </w:r>
+            <w:proofErr w:type="spellStart"/>
+            <w:r>
+              <w:rPr>
+                <w:b/>
+                <w:bCs/>
+              </w:rPr>
+              <w:t>Projetc</w:t>
+            </w:r>
+            <w:proofErr w:type="spellEnd"/>
             <w:r>
               <w:rPr>
                 <w:b/>
@@ -268,22 +242,6 @@
                 <w:bCs/>
               </w:rPr>
             </w:pPr>
-            <w:proofErr w:type="spellStart"/>
-            <w:r>
-              <w:rPr>
-                <w:b/>
-                <w:bCs/>
-              </w:rPr>
-              <w:t>c</w:t>
-            </w:r>
-            <w:r>
-              <w:rPr>
-                <w:b/>
-                <w:bCs/>
-              </w:rPr>
-              <w:t>ivitas-backend</w:t>
-            </w:r>
-            <w:proofErr w:type="spellEnd"/>
           </w:p>
         </w:tc>
       </w:tr>
@@ -304,21 +262,7 @@
                 <w:b/>
                 <w:bCs/>
               </w:rPr>
-              <w:t xml:space="preserve">Ano: </w:t>
-            </w:r>
-            <w:r>
-              <w:rPr>
-                <w:b/>
-                <w:bCs/>
-              </w:rPr>
-              <w:t>4</w:t>
-            </w:r>
-            <w:r>
-              <w:rPr>
-                <w:b/>
-                <w:bCs/>
-              </w:rPr>
-              <w:t>º</w:t>
+              <w:t>Ano: 5º</w:t>
             </w:r>
           </w:p>
         </w:tc>
@@ -386,16 +330,7 @@
             <w:tcW w:w="10201" w:type="dxa"/>
             <w:gridSpan w:val="4"/>
           </w:tcPr>
-          <w:p>
-            <w:proofErr w:type="spellStart"/>
-            <w:r>
-              <w:t>Adryan</w:t>
-            </w:r>
-            <w:proofErr w:type="spellEnd"/>
-            <w:r>
-              <w:t xml:space="preserve"> Thiago de Oliveira Francisco</w:t>
-            </w:r>
-          </w:p>
+          <w:p/>
         </w:tc>
       </w:tr>
       <w:tr>
@@ -404,19 +339,7 @@
             <w:tcW w:w="10201" w:type="dxa"/>
             <w:gridSpan w:val="4"/>
           </w:tcPr>
-          <w:p>
-            <w:r>
-              <w:t xml:space="preserve">Enzo </w:t>
-            </w:r>
-            <w:proofErr w:type="spellStart"/>
-            <w:r>
-              <w:t>Stafuza</w:t>
-            </w:r>
-            <w:proofErr w:type="spellEnd"/>
-            <w:r>
-              <w:t xml:space="preserve"> dos Santos</w:t>
-            </w:r>
-          </w:p>
+          <w:p/>
         </w:tc>
       </w:tr>
       <w:tr>
@@ -425,11 +348,7 @@
             <w:tcW w:w="10201" w:type="dxa"/>
             <w:gridSpan w:val="4"/>
           </w:tcPr>
-          <w:p>
-            <w:r>
-              <w:t>Gabriel de Oliveira Trinca</w:t>
-            </w:r>
-          </w:p>
+          <w:p/>
         </w:tc>
       </w:tr>
       <w:tr>
@@ -438,11 +357,7 @@
             <w:tcW w:w="10201" w:type="dxa"/>
             <w:gridSpan w:val="4"/>
           </w:tcPr>
-          <w:p>
-            <w:r>
-              <w:t>Giovanni da Silva Nascimento</w:t>
-            </w:r>
-          </w:p>
+          <w:p/>
         </w:tc>
       </w:tr>
       <w:tr>
@@ -451,37 +366,7 @@
             <w:tcW w:w="10201" w:type="dxa"/>
             <w:gridSpan w:val="4"/>
           </w:tcPr>
-          <w:p>
-            <w:r>
-              <w:t>Guilherme Henrique de Oliveira</w:t>
-            </w:r>
-          </w:p>
-        </w:tc>
-      </w:tr>
-      <w:tr>
-        <w:tc>
-          <w:tcPr>
-            <w:tcW w:w="10201" w:type="dxa"/>
-            <w:gridSpan w:val="4"/>
-          </w:tcPr>
-          <w:p>
-            <w:r>
-              <w:t>Wendell Alves Nascimento</w:t>
-            </w:r>
-          </w:p>
-        </w:tc>
-      </w:tr>
-      <w:tr>
-        <w:tc>
-          <w:tcPr>
-            <w:tcW w:w="10201" w:type="dxa"/>
-            <w:gridSpan w:val="4"/>
-          </w:tcPr>
-          <w:p>
-            <w:r>
-              <w:t>Yasmin Basso Moura</w:t>
-            </w:r>
-          </w:p>
+          <w:p/>
         </w:tc>
       </w:tr>
     </w:tbl>
@@ -529,13 +414,8 @@
             <w:tcW w:w="754" w:type="dxa"/>
           </w:tcPr>
           <w:p>
-            <w:proofErr w:type="spellStart"/>
-            <w:r>
-              <w:t>Task</w:t>
-            </w:r>
-            <w:proofErr w:type="spellEnd"/>
-            <w:r>
-              <w:t>#</w:t>
+            <w:r>
+              <w:t>Task#</w:t>
             </w:r>
           </w:p>
         </w:tc>
@@ -556,11 +436,9 @@
             <w:tcW w:w="1541" w:type="dxa"/>
           </w:tcPr>
           <w:p>
-            <w:proofErr w:type="gramStart"/>
             <w:r>
               <w:t>Start Date</w:t>
             </w:r>
-            <w:proofErr w:type="gramEnd"/>
           </w:p>
         </w:tc>
         <w:tc>
@@ -579,46 +457,25 @@
           <w:tcPr>
             <w:tcW w:w="754" w:type="dxa"/>
           </w:tcPr>
-          <w:p>
-            <w:r>
-              <w:t>002</w:t>
-            </w:r>
-          </w:p>
+          <w:p/>
         </w:tc>
         <w:tc>
           <w:tcPr>
             <w:tcW w:w="6234" w:type="dxa"/>
           </w:tcPr>
-          <w:p>
-            <w:pPr>
-              <w:jc w:val="center"/>
-            </w:pPr>
-            <w:r>
-              <w:t>Analisar e modificar (se necessário) a parte de Definição de Atores</w:t>
-            </w:r>
-          </w:p>
+          <w:p/>
         </w:tc>
         <w:tc>
           <w:tcPr>
             <w:tcW w:w="1541" w:type="dxa"/>
           </w:tcPr>
-          <w:p>
-            <w:r>
-              <w:t>24/09/2025</w:t>
-            </w:r>
-          </w:p>
+          <w:p/>
         </w:tc>
         <w:tc>
           <w:tcPr>
             <w:tcW w:w="1672" w:type="dxa"/>
           </w:tcPr>
-          <w:p>
-            <w:r>
-              <w:t>29/09/2025</w:t>
-            </w:r>
-            <w:bookmarkStart w:id="0" w:name="_GoBack"/>
-            <w:bookmarkEnd w:id="0"/>
-          </w:p>
+          <w:p/>
         </w:tc>
       </w:tr>
       <w:tr>
@@ -730,21 +587,12 @@
                 <w:bCs/>
               </w:rPr>
             </w:pPr>
-            <w:proofErr w:type="spellStart"/>
-            <w:r>
-              <w:rPr>
-                <w:b/>
-                <w:bCs/>
-              </w:rPr>
-              <w:t>Task</w:t>
-            </w:r>
-            <w:proofErr w:type="spellEnd"/>
-            <w:r>
-              <w:rPr>
-                <w:b/>
-                <w:bCs/>
-              </w:rPr>
-              <w:t xml:space="preserve"> </w:t>
+            <w:r>
+              <w:rPr>
+                <w:b/>
+                <w:bCs/>
+              </w:rPr>
+              <w:t xml:space="preserve">Task </w:t>
             </w:r>
             <w:proofErr w:type="spellStart"/>
             <w:r>
@@ -847,97 +695,37 @@
           <w:tcPr>
             <w:tcW w:w="828" w:type="dxa"/>
           </w:tcPr>
-          <w:p>
-            <w:r>
-              <w:t>002</w:t>
-            </w:r>
-          </w:p>
+          <w:p/>
         </w:tc>
         <w:tc>
           <w:tcPr>
             <w:tcW w:w="2971" w:type="dxa"/>
           </w:tcPr>
-          <w:p>
-            <w:r>
-              <w:t>Revisar e ajustar a definição de atores no sistema, garantindo que todos os papéis estejam corretos, completos e bem descritos.</w:t>
-            </w:r>
-          </w:p>
+          <w:p/>
         </w:tc>
         <w:tc>
           <w:tcPr>
             <w:tcW w:w="1441" w:type="dxa"/>
           </w:tcPr>
-          <w:p>
-            <w:proofErr w:type="spellStart"/>
-            <w:r>
-              <w:t>Adryan</w:t>
-            </w:r>
-            <w:proofErr w:type="spellEnd"/>
-          </w:p>
-          <w:p>
-            <w:r>
-              <w:t>Enzo</w:t>
-            </w:r>
-          </w:p>
-          <w:p>
-            <w:r>
-              <w:t>Gabriel</w:t>
-            </w:r>
-          </w:p>
-          <w:p>
-            <w:r>
-              <w:t>Giovanni</w:t>
-            </w:r>
-          </w:p>
-          <w:p>
-            <w:r>
-              <w:t>Guilherme</w:t>
-            </w:r>
-          </w:p>
-          <w:p>
-            <w:r>
-              <w:t>Wendell</w:t>
-            </w:r>
-          </w:p>
-          <w:p>
-            <w:r>
-              <w:t>Y</w:t>
-            </w:r>
-            <w:r>
-              <w:t>asmin</w:t>
-            </w:r>
-          </w:p>
           <w:p/>
         </w:tc>
         <w:tc>
           <w:tcPr>
             <w:tcW w:w="1418" w:type="dxa"/>
           </w:tcPr>
-          <w:p>
-            <w:r>
-              <w:t>Entregue</w:t>
-            </w:r>
-          </w:p>
+          <w:p/>
         </w:tc>
         <w:tc>
           <w:tcPr>
             <w:tcW w:w="1842" w:type="dxa"/>
           </w:tcPr>
-          <w:p>
-            <w:r>
-              <w:t>10</w:t>
-            </w:r>
-          </w:p>
+          <w:p/>
         </w:tc>
         <w:tc>
           <w:tcPr>
             <w:tcW w:w="1683" w:type="dxa"/>
           </w:tcPr>
-          <w:p>
-            <w:r>
-              <w:t>10</w:t>
-            </w:r>
-          </w:p>
+          <w:p/>
         </w:tc>
       </w:tr>
       <w:tr>
@@ -1055,9 +843,19 @@
     </w:p>
     <w:p>
       <w:r>
-        <w:t>Revisar e ajustar a definição de atores no sistema, garantindo que todos os papéis estejam corretos, completos e bem descritos.</w:t>
+        <w:t xml:space="preserve">** Descrição do que foi designado </w:t>
+      </w:r>
+      <w:proofErr w:type="spellStart"/>
+      <w:r>
+        <w:t>na</w:t>
+      </w:r>
+      <w:proofErr w:type="spellEnd"/>
+      <w:r>
+        <w:t xml:space="preserve"> sprint</w:t>
       </w:r>
     </w:p>
+    <w:p/>
+    <w:p/>
     <w:p/>
     <w:tbl>
       <w:tblPr>
@@ -1112,254 +910,33 @@
     </w:tbl>
     <w:p/>
     <w:p>
-      <w:pPr>
-        <w:pStyle w:val="PargrafodaLista"/>
-        <w:numPr>
-          <w:ilvl w:val="0"/>
-          <w:numId w:val="6"/>
-        </w:numPr>
-        <w:rPr>
-          <w:rFonts w:ascii="Aptos" w:eastAsia="Aptos" w:hAnsi="Aptos" w:cs="Aptos"/>
-          <w:color w:val="000000" w:themeColor="text1"/>
-        </w:rPr>
-      </w:pPr>
       <w:r>
-        <w:rPr>
-          <w:rFonts w:ascii="Aptos" w:eastAsia="Aptos" w:hAnsi="Aptos" w:cs="Aptos"/>
-          <w:color w:val="000000" w:themeColor="text1"/>
-        </w:rPr>
-        <w:t>Definição dos Atores</w:t>
+        <w:t>Descrição do que foi produzido, com diagramas de caso de uso, diagrama de sequência, diagrama com as classes afetadas nas sprint.</w:t>
       </w:r>
     </w:p>
     <w:p>
-      <w:pPr>
-        <w:rPr>
-          <w:rFonts w:ascii="Aptos" w:eastAsia="Aptos" w:hAnsi="Aptos" w:cs="Aptos"/>
-          <w:color w:val="000000" w:themeColor="text1"/>
-        </w:rPr>
-      </w:pPr>
       <w:r>
-        <w:rPr>
-          <w:rFonts w:ascii="Aptos" w:eastAsia="Aptos" w:hAnsi="Aptos" w:cs="Aptos"/>
-          <w:color w:val="000000" w:themeColor="text1"/>
-        </w:rPr>
-        <w:t>Foi preciso refazer a parte de definição dos atores, os atores não mudaram, mas suas descrições sim.</w:t>
+        <w:t>Se necessário colocar outros diagramas.</w:t>
       </w:r>
     </w:p>
     <w:p>
-      <w:pPr>
-        <w:rPr>
-          <w:rFonts w:ascii="Aptos" w:eastAsia="Aptos" w:hAnsi="Aptos" w:cs="Aptos"/>
-          <w:color w:val="000000" w:themeColor="text1"/>
-        </w:rPr>
-      </w:pPr>
       <w:r>
-        <w:rPr>
-          <w:rFonts w:ascii="Aptos" w:eastAsia="Aptos" w:hAnsi="Aptos" w:cs="Aptos"/>
-          <w:color w:val="000000" w:themeColor="text1"/>
-        </w:rPr>
-        <w:t>Os principais erros encontrados foram o do ator Público encontrado em algumas descrições, sendo que esse ator não existe no sistema, ele é definido como Visitante. O ator Funcionário nas descrições estava sendo descrito como um Visitante, fazia a mesma coisa que um Visitante, porém, tinha um nome diferente .</w:t>
+        <w:t>Colocar imagens das telas produzidas.</w:t>
       </w:r>
     </w:p>
     <w:p>
-      <w:pPr>
-        <w:rPr>
-          <w:rFonts w:ascii="Aptos" w:eastAsia="Aptos" w:hAnsi="Aptos" w:cs="Aptos"/>
-          <w:color w:val="000000" w:themeColor="text1"/>
-        </w:rPr>
-      </w:pPr>
       <w:r>
-        <w:rPr>
-          <w:rFonts w:ascii="Aptos" w:eastAsia="Aptos" w:hAnsi="Aptos" w:cs="Aptos"/>
-          <w:color w:val="000000" w:themeColor="text1"/>
-        </w:rPr>
-        <w:lastRenderedPageBreak/>
-        <w:t>Os textos atualizados ficaram assim:</w:t>
+        <w:t>Descrever o que foi bem durante a sprint – aprendizados.</w:t>
       </w:r>
     </w:p>
     <w:p>
-      <w:pPr>
-        <w:spacing w:line="360" w:lineRule="auto"/>
-        <w:ind w:left="179" w:right="288" w:firstLine="850"/>
-        <w:jc w:val="both"/>
-        <w:rPr>
-          <w:rFonts w:ascii="Aptos" w:eastAsia="Aptos" w:hAnsi="Aptos" w:cs="Aptos"/>
-          <w:color w:val="000000" w:themeColor="text1"/>
-        </w:rPr>
-      </w:pPr>
       <w:r>
-        <w:rPr>
-          <w:rFonts w:ascii="Aptos" w:eastAsia="Aptos" w:hAnsi="Aptos" w:cs="Aptos"/>
-          <w:color w:val="000000" w:themeColor="text1"/>
-          <w:lang w:val="pt-PT"/>
-        </w:rPr>
-        <w:t xml:space="preserve">Conforme apresentado na Figura 9, a definição estrutural no diagrama de classes para o diagrama de atores evita o uso de herança. Essa escolha é fundamentada nos princípios do </w:t>
-      </w:r>
-      <w:r>
-        <w:rPr>
-          <w:rFonts w:ascii="Aptos" w:eastAsia="Aptos" w:hAnsi="Aptos" w:cs="Aptos"/>
-          <w:i/>
-          <w:iCs/>
-          <w:color w:val="000000" w:themeColor="text1"/>
-          <w:lang w:val="pt-PT"/>
-        </w:rPr>
-        <w:t>SOLID</w:t>
-      </w:r>
-      <w:r>
-        <w:rPr>
-          <w:rFonts w:ascii="Aptos" w:eastAsia="Aptos" w:hAnsi="Aptos" w:cs="Aptos"/>
-          <w:color w:val="000000" w:themeColor="text1"/>
-          <w:vertAlign w:val="superscript"/>
-          <w:lang w:val="pt-PT"/>
-        </w:rPr>
-        <w:t>1</w:t>
-      </w:r>
-      <w:r>
-        <w:rPr>
-          <w:rFonts w:ascii="Aptos" w:eastAsia="Aptos" w:hAnsi="Aptos" w:cs="Aptos"/>
-          <w:color w:val="000000" w:themeColor="text1"/>
-          <w:lang w:val="pt-PT"/>
-        </w:rPr>
-        <w:t>, em especial no Princípio da Substituição de Liskov (LSP) e no Princípio de Segregação de Interfaces (ISP). De acordo com esses princípios, deve-se priorizar o uso da composição em vez da herança, pois a composição oferece maior flexibilidade e modularidade. Além disso, essa abordagem reduz o acoplamento entre as classes, mantendo a coesão e a consistência do sistema (Aniche, 2011).</w:t>
+        <w:t>Descrever o que não pode ser implementado com justificativa.</w:t>
       </w:r>
     </w:p>
     <w:p>
-      <w:pPr>
-        <w:spacing w:before="3" w:line="360" w:lineRule="auto"/>
-        <w:ind w:left="179" w:right="294" w:firstLine="850"/>
-        <w:jc w:val="both"/>
-        <w:rPr>
-          <w:rFonts w:ascii="Aptos" w:eastAsia="Aptos" w:hAnsi="Aptos" w:cs="Aptos"/>
-          <w:color w:val="000000" w:themeColor="text1"/>
-        </w:rPr>
-      </w:pPr>
       <w:r>
-        <w:rPr>
-          <w:rFonts w:ascii="Aptos" w:eastAsia="Aptos" w:hAnsi="Aptos" w:cs="Aptos"/>
-          <w:color w:val="000000" w:themeColor="text1"/>
-          <w:lang w:val="pt-PT"/>
-        </w:rPr>
-        <w:t>Na Figura 9 também é apresentado a classe “Tipo Usuário”, que é classificada como um estereótipo do tipo &lt;&lt;</w:t>
-      </w:r>
-      <w:r>
-        <w:rPr>
-          <w:rFonts w:ascii="Aptos" w:eastAsia="Aptos" w:hAnsi="Aptos" w:cs="Aptos"/>
-          <w:i/>
-          <w:iCs/>
-          <w:color w:val="000000" w:themeColor="text1"/>
-          <w:lang w:val="pt-PT"/>
-        </w:rPr>
-        <w:t>enumeration</w:t>
-      </w:r>
-      <w:r>
-        <w:rPr>
-          <w:rFonts w:ascii="Aptos" w:eastAsia="Aptos" w:hAnsi="Aptos" w:cs="Aptos"/>
-          <w:color w:val="000000" w:themeColor="text1"/>
-          <w:lang w:val="pt-PT"/>
-        </w:rPr>
-        <w:t>&gt;&gt;. De acordo com Guedes (2018, p. 171), “essa classe lista todos os valores válidos que um tipo de dados pode assumir”. Ou seja, no contexto do sistema, o dado em questão é o “Usuário” e os valores que ele pode assumir são “Visitante”, “Funcionário” e “Administrador”. Isso possibilita a definição de diferentes níveis de acesso ao sistema, garantindo que cada tipo de usuário tenha permissões específicas, de acordo com suas responsabilidades e funções dentro da plataforma.</w:t>
-      </w:r>
-    </w:p>
-    <w:p>
-      <w:pPr>
-        <w:spacing w:line="360" w:lineRule="auto"/>
-        <w:ind w:left="179" w:right="295" w:firstLine="850"/>
-        <w:jc w:val="both"/>
-        <w:rPr>
-          <w:rFonts w:ascii="Aptos" w:eastAsia="Aptos" w:hAnsi="Aptos" w:cs="Aptos"/>
-          <w:color w:val="000000" w:themeColor="text1"/>
-        </w:rPr>
-      </w:pPr>
-      <w:r>
-        <w:rPr>
-          <w:rFonts w:ascii="Aptos" w:eastAsia="Aptos" w:hAnsi="Aptos" w:cs="Aptos"/>
-          <w:color w:val="000000" w:themeColor="text1"/>
-          <w:lang w:val="pt-PT"/>
-        </w:rPr>
-        <w:t>O ator "Pessoa" (Figura 9) representa coletivamente todos os tipos de usuários envolvidos, incluindo Administradores, Funcionários e o Visitante. Esse ator abrange todas as interações possíveis no sistema, desde administração e manutenção por parte dos Administradores, até as operações diárias dos Funcionários responsáveis pelo registro e acompanhamento das despesas. Além disso, o Visitante, como Pessoa, pode acessar informações específicas de forma mais restrita, promovendo transparência nas atividades financeiras da prefeitura. O ator "Pessoa" encapsula as diversas necessidades e permissões associadas aos diferentes papéis dentro do contexto do sistema de gerenciamento de despesas.</w:t>
-      </w:r>
-    </w:p>
-    <w:p>
-      <w:pPr>
-        <w:ind w:left="321" w:firstLine="708"/>
-        <w:rPr>
-          <w:rFonts w:ascii="Aptos" w:eastAsia="Aptos" w:hAnsi="Aptos" w:cs="Aptos"/>
-          <w:color w:val="000000" w:themeColor="text1"/>
-        </w:rPr>
-      </w:pPr>
-      <w:r>
-        <w:rPr>
-          <w:rFonts w:ascii="Aptos" w:eastAsia="Aptos" w:hAnsi="Aptos" w:cs="Aptos"/>
-          <w:color w:val="000000" w:themeColor="text1"/>
-          <w:lang w:val="pt-PT"/>
-        </w:rPr>
-        <w:t>O ator "Administrador" (Figura 9) desempenha o papel central na administração e supervisão do sistema. Suas responsabilidades incluem a configuração e manutenção do sistema, a gestão de usuários e permissões, a definição de parâmetros do sistema, e a geração de relatórios estratégicos. O Administrador possui o controle global sobre as funcionalidades do sistema, garantindo que este atenda aos requisitos da prefeitura e que as operações sejam conduzidas de maneira eficiente e segura.</w:t>
-      </w:r>
-    </w:p>
-    <w:p>
-      <w:pPr>
-        <w:spacing w:line="360" w:lineRule="auto"/>
-        <w:ind w:left="179" w:right="296" w:firstLine="850"/>
-        <w:jc w:val="both"/>
-        <w:rPr>
-          <w:rFonts w:ascii="Aptos" w:eastAsia="Aptos" w:hAnsi="Aptos" w:cs="Aptos"/>
-          <w:color w:val="000000" w:themeColor="text1"/>
-        </w:rPr>
-      </w:pPr>
-      <w:r>
-        <w:rPr>
-          <w:rFonts w:ascii="Aptos" w:eastAsia="Aptos" w:hAnsi="Aptos" w:cs="Aptos"/>
-          <w:color w:val="000000" w:themeColor="text1"/>
-          <w:lang w:val="pt-PT"/>
-        </w:rPr>
-        <w:t>O ator "Funcionário" (Figura 9) representa os usuários operacionais que utilizam o sistema para realizar tarefas específicas relacionadas ao gerenciamento e registro de despesas. Suas responsabilidades podem incluir o cadastro de despesas, a associação de despesas a instituições, a consulta de relatórios e a interação direta com as funcionalidades cotidianas do sistema. O Funcionário desempenha um papel crucial na entrada de dados e na execução de operações diárias para garantir a precisão e integridade das informações registradas no sistema de gerenciamento de despesas.</w:t>
-      </w:r>
-    </w:p>
-    <w:p>
-      <w:pPr>
-        <w:spacing w:line="360" w:lineRule="auto"/>
-        <w:ind w:left="179" w:right="298" w:firstLine="850"/>
-        <w:jc w:val="both"/>
-        <w:rPr>
-          <w:rFonts w:ascii="Aptos" w:eastAsia="Aptos" w:hAnsi="Aptos" w:cs="Aptos"/>
-          <w:color w:val="000000" w:themeColor="text1"/>
-        </w:rPr>
-      </w:pPr>
-      <w:r>
-        <w:rPr>
-          <w:rFonts w:ascii="Aptos" w:eastAsia="Aptos" w:hAnsi="Aptos" w:cs="Aptos"/>
-          <w:color w:val="000000" w:themeColor="text1"/>
-          <w:lang w:val="pt-PT"/>
-        </w:rPr>
-        <w:t xml:space="preserve">O ator "Visitante" (Figura 9) refere-se aos usuários externos, como cidadãos, contribuintes ou qualquer outra parte interessada que tenha acesso limitado ao sistema. O acesso do Visitante geralmente é direcionado para consultar informações públicas sobre despesas, orçamentos ou relatórios que a prefeitura opta por tornar disponíveis. Essa categoria de usuários pode visualizar dados específicos, geralmente de forma transparente, contribuindo para a prestação de contas e transparência na gestão financeira da prefeitura. Suas </w:t>
-      </w:r>
-      <w:r>
-        <w:rPr>
-          <w:rFonts w:ascii="Aptos" w:eastAsia="Aptos" w:hAnsi="Aptos" w:cs="Aptos"/>
-          <w:color w:val="000000" w:themeColor="text1"/>
-          <w:lang w:val="pt-PT"/>
-        </w:rPr>
-        <w:lastRenderedPageBreak/>
-        <w:t>interações são frequentemente limitadas a consultas e visualização de informações, sem permissão para realizar ações de entrada de dados ou configuração no sistema.</w:t>
-      </w:r>
-    </w:p>
-    <w:p>
-      <w:pPr>
-        <w:spacing w:before="1" w:line="360" w:lineRule="auto"/>
-        <w:ind w:left="179" w:right="290" w:firstLine="850"/>
-        <w:jc w:val="both"/>
-        <w:rPr>
-          <w:rFonts w:ascii="Aptos" w:eastAsia="Aptos" w:hAnsi="Aptos" w:cs="Aptos"/>
-          <w:color w:val="000000" w:themeColor="text1"/>
-        </w:rPr>
-      </w:pPr>
-      <w:r>
-        <w:rPr>
-          <w:rFonts w:ascii="Aptos" w:eastAsia="Aptos" w:hAnsi="Aptos" w:cs="Aptos"/>
-          <w:color w:val="000000" w:themeColor="text1"/>
-          <w:lang w:val="pt-PT"/>
-        </w:rPr>
-        <w:t>O ator "Sistema" (Figura 9) refere-se à própria aplicação ou plataforma. Este ator não representa um usuário humano, mas sim o conjunto de funcionalidades, processos e lógicas incorporadas no software. O Sistema desempenha um papel central na automação de tarefas, processamento de dados, armazenamento de informações e execução de operações específicas relacionadas ao gerenciamento de despesas. Ele é projetado para suportar os diferentes papéis de usuários (Administrador, Funcionário, Visitante) e facilitar eficientemente as operações e análises relacionadas às atividades financeiras da prefeitura.</w:t>
+        <w:t>Descrever os testes realizados (se necessário)</w:t>
       </w:r>
     </w:p>
     <w:p/>
@@ -1376,6 +953,7 @@
           <w:sz w:val="24"/>
           <w:szCs w:val="24"/>
         </w:rPr>
+        <w:lastRenderedPageBreak/>
         <w:t>Assinaturas</w:t>
       </w:r>
     </w:p>
@@ -1390,7 +968,7 @@
 </file>
 
 <file path=word/endnotes.xml><?xml version="1.0" encoding="utf-8"?>
-<w:endnotes xmlns:wpc="http://schemas.microsoft.com/office/word/2010/wordprocessingCanvas" xmlns:cx="http://schemas.microsoft.com/office/drawing/2014/chartex" xmlns:cx1="http://schemas.microsoft.com/office/drawing/2015/9/8/chartex" xmlns:cx2="http://schemas.microsoft.com/office/drawing/2015/10/21/chartex" xmlns:cx3="http://schemas.microsoft.com/office/drawing/2016/5/9/chartex" xmlns:cx4="http://schemas.microsoft.com/office/drawing/2016/5/10/chartex" xmlns:cx5="http://schemas.microsoft.com/office/drawing/2016/5/11/chartex" xmlns:cx6="http://schemas.microsoft.com/office/drawing/2016/5/12/chartex" xmlns:cx7="http://schemas.microsoft.com/office/drawing/2016/5/13/chartex" xmlns:cx8="http://schemas.microsoft.com/office/drawing/2016/5/14/chartex" xmlns:mc="http://schemas.openxmlformats.org/markup-compatibility/2006" xmlns:aink="http://schemas.microsoft.com/office/drawing/2016/ink" xmlns:am3d="http://schemas.microsoft.com/office/drawing/2017/model3d" xmlns:o="urn:schemas-microsoft-com:office:office" xmlns:r="http://schemas.openxmlformats.org/officeDocument/2006/relationships" xmlns:m="http://schemas.openxmlformats.org/officeDocument/2006/math" xmlns:v="urn:schemas-microsoft-com:vml" xmlns:wp14="http://schemas.microsoft.com/office/word/2010/wordprocessingDrawing" xmlns:wp="http://schemas.openxmlformats.org/drawingml/2006/wordprocessingDrawing" xmlns:w10="urn:schemas-microsoft-com:office:word" xmlns:w="http://schemas.openxmlformats.org/wordprocessingml/2006/main" xmlns:w14="http://schemas.microsoft.com/office/word/2010/wordml" xmlns:w15="http://schemas.microsoft.com/office/word/2012/wordml" xmlns:w16cid="http://schemas.microsoft.com/office/word/2016/wordml/cid" xmlns:w16se="http://schemas.microsoft.com/office/word/2015/wordml/symex" xmlns:wpg="http://schemas.microsoft.com/office/word/2010/wordprocessingGroup" xmlns:wpi="http://schemas.microsoft.com/office/word/2010/wordprocessingInk" xmlns:wne="http://schemas.microsoft.com/office/word/2006/wordml" xmlns:wps="http://schemas.microsoft.com/office/word/2010/wordprocessingShape" mc:Ignorable="w14 w15 w16se w16cid wp14">
+<w:endnotes xmlns:wpc="http://schemas.microsoft.com/office/word/2010/wordprocessingCanvas" xmlns:cx="http://schemas.microsoft.com/office/drawing/2014/chartex" xmlns:cx1="http://schemas.microsoft.com/office/drawing/2015/9/8/chartex" xmlns:cx2="http://schemas.microsoft.com/office/drawing/2015/10/21/chartex" xmlns:cx3="http://schemas.microsoft.com/office/drawing/2016/5/9/chartex" xmlns:cx4="http://schemas.microsoft.com/office/drawing/2016/5/10/chartex" xmlns:cx5="http://schemas.microsoft.com/office/drawing/2016/5/11/chartex" xmlns:cx6="http://schemas.microsoft.com/office/drawing/2016/5/12/chartex" xmlns:cx7="http://schemas.microsoft.com/office/drawing/2016/5/13/chartex" xmlns:cx8="http://schemas.microsoft.com/office/drawing/2016/5/14/chartex" xmlns:mc="http://schemas.openxmlformats.org/markup-compatibility/2006" xmlns:aink="http://schemas.microsoft.com/office/drawing/2016/ink" xmlns:am3d="http://schemas.microsoft.com/office/drawing/2017/model3d" xmlns:o="urn:schemas-microsoft-com:office:office" xmlns:oel="http://schemas.microsoft.com/office/2019/extlst" xmlns:r="http://schemas.openxmlformats.org/officeDocument/2006/relationships" xmlns:m="http://schemas.openxmlformats.org/officeDocument/2006/math" xmlns:v="urn:schemas-microsoft-com:vml" xmlns:wp14="http://schemas.microsoft.com/office/word/2010/wordprocessingDrawing" xmlns:wp="http://schemas.openxmlformats.org/drawingml/2006/wordprocessingDrawing" xmlns:w10="urn:schemas-microsoft-com:office:word" xmlns:w="http://schemas.openxmlformats.org/wordprocessingml/2006/main" xmlns:w14="http://schemas.microsoft.com/office/word/2010/wordml" xmlns:w15="http://schemas.microsoft.com/office/word/2012/wordml" xmlns:w16cex="http://schemas.microsoft.com/office/word/2018/wordml/cex" xmlns:w16cid="http://schemas.microsoft.com/office/word/2016/wordml/cid" xmlns:w16="http://schemas.microsoft.com/office/word/2018/wordml" xmlns:w16du="http://schemas.microsoft.com/office/word/2023/wordml/word16du" xmlns:w16sdtdh="http://schemas.microsoft.com/office/word/2020/wordml/sdtdatahash" xmlns:w16sdtfl="http://schemas.microsoft.com/office/word/2024/wordml/sdtformatlock" xmlns:w16se="http://schemas.microsoft.com/office/word/2015/wordml/symex" xmlns:wpg="http://schemas.microsoft.com/office/word/2010/wordprocessingGroup" xmlns:wpi="http://schemas.microsoft.com/office/word/2010/wordprocessingInk" xmlns:wne="http://schemas.microsoft.com/office/word/2006/wordml" xmlns:wps="http://schemas.microsoft.com/office/word/2010/wordprocessingShape" mc:Ignorable="w14 w15 w16se w16cid w16 w16cex w16sdtdh w16sdtfl w16du wp14">
   <w:endnote w:type="separator" w:id="-1">
     <w:p>
       <w:pPr>
@@ -1415,7 +993,7 @@
 </file>
 
 <file path=word/footnotes.xml><?xml version="1.0" encoding="utf-8"?>
-<w:footnotes xmlns:wpc="http://schemas.microsoft.com/office/word/2010/wordprocessingCanvas" xmlns:cx="http://schemas.microsoft.com/office/drawing/2014/chartex" xmlns:cx1="http://schemas.microsoft.com/office/drawing/2015/9/8/chartex" xmlns:cx2="http://schemas.microsoft.com/office/drawing/2015/10/21/chartex" xmlns:cx3="http://schemas.microsoft.com/office/drawing/2016/5/9/chartex" xmlns:cx4="http://schemas.microsoft.com/office/drawing/2016/5/10/chartex" xmlns:cx5="http://schemas.microsoft.com/office/drawing/2016/5/11/chartex" xmlns:cx6="http://schemas.microsoft.com/office/drawing/2016/5/12/chartex" xmlns:cx7="http://schemas.microsoft.com/office/drawing/2016/5/13/chartex" xmlns:cx8="http://schemas.microsoft.com/office/drawing/2016/5/14/chartex" xmlns:mc="http://schemas.openxmlformats.org/markup-compatibility/2006" xmlns:aink="http://schemas.microsoft.com/office/drawing/2016/ink" xmlns:am3d="http://schemas.microsoft.com/office/drawing/2017/model3d" xmlns:o="urn:schemas-microsoft-com:office:office" xmlns:r="http://schemas.openxmlformats.org/officeDocument/2006/relationships" xmlns:m="http://schemas.openxmlformats.org/officeDocument/2006/math" xmlns:v="urn:schemas-microsoft-com:vml" xmlns:wp14="http://schemas.microsoft.com/office/word/2010/wordprocessingDrawing" xmlns:wp="http://schemas.openxmlformats.org/drawingml/2006/wordprocessingDrawing" xmlns:w10="urn:schemas-microsoft-com:office:word" xmlns:w="http://schemas.openxmlformats.org/wordprocessingml/2006/main" xmlns:w14="http://schemas.microsoft.com/office/word/2010/wordml" xmlns:w15="http://schemas.microsoft.com/office/word/2012/wordml" xmlns:w16cid="http://schemas.microsoft.com/office/word/2016/wordml/cid" xmlns:w16se="http://schemas.microsoft.com/office/word/2015/wordml/symex" xmlns:wpg="http://schemas.microsoft.com/office/word/2010/wordprocessingGroup" xmlns:wpi="http://schemas.microsoft.com/office/word/2010/wordprocessingInk" xmlns:wne="http://schemas.microsoft.com/office/word/2006/wordml" xmlns:wps="http://schemas.microsoft.com/office/word/2010/wordprocessingShape" mc:Ignorable="w14 w15 w16se w16cid wp14">
+<w:footnotes xmlns:wpc="http://schemas.microsoft.com/office/word/2010/wordprocessingCanvas" xmlns:cx="http://schemas.microsoft.com/office/drawing/2014/chartex" xmlns:cx1="http://schemas.microsoft.com/office/drawing/2015/9/8/chartex" xmlns:cx2="http://schemas.microsoft.com/office/drawing/2015/10/21/chartex" xmlns:cx3="http://schemas.microsoft.com/office/drawing/2016/5/9/chartex" xmlns:cx4="http://schemas.microsoft.com/office/drawing/2016/5/10/chartex" xmlns:cx5="http://schemas.microsoft.com/office/drawing/2016/5/11/chartex" xmlns:cx6="http://schemas.microsoft.com/office/drawing/2016/5/12/chartex" xmlns:cx7="http://schemas.microsoft.com/office/drawing/2016/5/13/chartex" xmlns:cx8="http://schemas.microsoft.com/office/drawing/2016/5/14/chartex" xmlns:mc="http://schemas.openxmlformats.org/markup-compatibility/2006" xmlns:aink="http://schemas.microsoft.com/office/drawing/2016/ink" xmlns:am3d="http://schemas.microsoft.com/office/drawing/2017/model3d" xmlns:o="urn:schemas-microsoft-com:office:office" xmlns:oel="http://schemas.microsoft.com/office/2019/extlst" xmlns:r="http://schemas.openxmlformats.org/officeDocument/2006/relationships" xmlns:m="http://schemas.openxmlformats.org/officeDocument/2006/math" xmlns:v="urn:schemas-microsoft-com:vml" xmlns:wp14="http://schemas.microsoft.com/office/word/2010/wordprocessingDrawing" xmlns:wp="http://schemas.openxmlformats.org/drawingml/2006/wordprocessingDrawing" xmlns:w10="urn:schemas-microsoft-com:office:word" xmlns:w="http://schemas.openxmlformats.org/wordprocessingml/2006/main" xmlns:w14="http://schemas.microsoft.com/office/word/2010/wordml" xmlns:w15="http://schemas.microsoft.com/office/word/2012/wordml" xmlns:w16cex="http://schemas.microsoft.com/office/word/2018/wordml/cex" xmlns:w16cid="http://schemas.microsoft.com/office/word/2016/wordml/cid" xmlns:w16="http://schemas.microsoft.com/office/word/2018/wordml" xmlns:w16du="http://schemas.microsoft.com/office/word/2023/wordml/word16du" xmlns:w16sdtdh="http://schemas.microsoft.com/office/word/2020/wordml/sdtdatahash" xmlns:w16sdtfl="http://schemas.microsoft.com/office/word/2024/wordml/sdtformatlock" xmlns:w16se="http://schemas.microsoft.com/office/word/2015/wordml/symex" xmlns:wpg="http://schemas.microsoft.com/office/word/2010/wordprocessingGroup" xmlns:wpi="http://schemas.microsoft.com/office/word/2010/wordprocessingInk" xmlns:wne="http://schemas.microsoft.com/office/word/2006/wordml" xmlns:wps="http://schemas.microsoft.com/office/word/2010/wordprocessingShape" mc:Ignorable="w14 w15 w16se w16cid w16 w16cex w16sdtdh w16sdtfl w16du wp14">
   <w:footnote w:type="separator" w:id="-1">
     <w:p>
       <w:pPr>
@@ -1439,562 +1017,8 @@
 </w:footnotes>
 </file>
 
-<file path=word/numbering.xml><?xml version="1.0" encoding="utf-8"?>
-<w:numbering xmlns:wpc="http://schemas.microsoft.com/office/word/2010/wordprocessingCanvas" xmlns:cx="http://schemas.microsoft.com/office/drawing/2014/chartex" xmlns:cx1="http://schemas.microsoft.com/office/drawing/2015/9/8/chartex" xmlns:cx2="http://schemas.microsoft.com/office/drawing/2015/10/21/chartex" xmlns:cx3="http://schemas.microsoft.com/office/drawing/2016/5/9/chartex" xmlns:cx4="http://schemas.microsoft.com/office/drawing/2016/5/10/chartex" xmlns:cx5="http://schemas.microsoft.com/office/drawing/2016/5/11/chartex" xmlns:cx6="http://schemas.microsoft.com/office/drawing/2016/5/12/chartex" xmlns:cx7="http://schemas.microsoft.com/office/drawing/2016/5/13/chartex" xmlns:cx8="http://schemas.microsoft.com/office/drawing/2016/5/14/chartex" xmlns:mc="http://schemas.openxmlformats.org/markup-compatibility/2006" xmlns:aink="http://schemas.microsoft.com/office/drawing/2016/ink" xmlns:am3d="http://schemas.microsoft.com/office/drawing/2017/model3d" xmlns:o="urn:schemas-microsoft-com:office:office" xmlns:r="http://schemas.openxmlformats.org/officeDocument/2006/relationships" xmlns:m="http://schemas.openxmlformats.org/officeDocument/2006/math" xmlns:v="urn:schemas-microsoft-com:vml" xmlns:wp14="http://schemas.microsoft.com/office/word/2010/wordprocessingDrawing" xmlns:wp="http://schemas.openxmlformats.org/drawingml/2006/wordprocessingDrawing" xmlns:w10="urn:schemas-microsoft-com:office:word" xmlns:w="http://schemas.openxmlformats.org/wordprocessingml/2006/main" xmlns:w14="http://schemas.microsoft.com/office/word/2010/wordml" xmlns:w15="http://schemas.microsoft.com/office/word/2012/wordml" xmlns:w16cid="http://schemas.microsoft.com/office/word/2016/wordml/cid" xmlns:w16se="http://schemas.microsoft.com/office/word/2015/wordml/symex" xmlns:wpg="http://schemas.microsoft.com/office/word/2010/wordprocessingGroup" xmlns:wpi="http://schemas.microsoft.com/office/word/2010/wordprocessingInk" xmlns:wne="http://schemas.microsoft.com/office/word/2006/wordml" xmlns:wps="http://schemas.microsoft.com/office/word/2010/wordprocessingShape" mc:Ignorable="w14 w15 w16se w16cid wp14">
-  <w:abstractNum w:abstractNumId="0" w15:restartNumberingAfterBreak="0">
-    <w:nsid w:val="18397EAF"/>
-    <w:multiLevelType w:val="hybridMultilevel"/>
-    <w:tmpl w:val="33E07726"/>
-    <w:lvl w:ilvl="0" w:tplc="3D1013BA">
-      <w:start w:val="2"/>
-      <w:numFmt w:val="decimal"/>
-      <w:lvlText w:val="%1-"/>
-      <w:lvlJc w:val="left"/>
-      <w:pPr>
-        <w:ind w:left="720" w:hanging="360"/>
-      </w:pPr>
-      <w:rPr>
-        <w:rFonts w:hint="default"/>
-      </w:rPr>
-    </w:lvl>
-    <w:lvl w:ilvl="1" w:tplc="04160019" w:tentative="1">
-      <w:start w:val="1"/>
-      <w:numFmt w:val="lowerLetter"/>
-      <w:lvlText w:val="%2."/>
-      <w:lvlJc w:val="left"/>
-      <w:pPr>
-        <w:ind w:left="1440" w:hanging="360"/>
-      </w:pPr>
-    </w:lvl>
-    <w:lvl w:ilvl="2" w:tplc="0416001B" w:tentative="1">
-      <w:start w:val="1"/>
-      <w:numFmt w:val="lowerRoman"/>
-      <w:lvlText w:val="%3."/>
-      <w:lvlJc w:val="right"/>
-      <w:pPr>
-        <w:ind w:left="2160" w:hanging="180"/>
-      </w:pPr>
-    </w:lvl>
-    <w:lvl w:ilvl="3" w:tplc="0416000F" w:tentative="1">
-      <w:start w:val="1"/>
-      <w:numFmt w:val="decimal"/>
-      <w:lvlText w:val="%4."/>
-      <w:lvlJc w:val="left"/>
-      <w:pPr>
-        <w:ind w:left="2880" w:hanging="360"/>
-      </w:pPr>
-    </w:lvl>
-    <w:lvl w:ilvl="4" w:tplc="04160019" w:tentative="1">
-      <w:start w:val="1"/>
-      <w:numFmt w:val="lowerLetter"/>
-      <w:lvlText w:val="%5."/>
-      <w:lvlJc w:val="left"/>
-      <w:pPr>
-        <w:ind w:left="3600" w:hanging="360"/>
-      </w:pPr>
-    </w:lvl>
-    <w:lvl w:ilvl="5" w:tplc="0416001B" w:tentative="1">
-      <w:start w:val="1"/>
-      <w:numFmt w:val="lowerRoman"/>
-      <w:lvlText w:val="%6."/>
-      <w:lvlJc w:val="right"/>
-      <w:pPr>
-        <w:ind w:left="4320" w:hanging="180"/>
-      </w:pPr>
-    </w:lvl>
-    <w:lvl w:ilvl="6" w:tplc="0416000F" w:tentative="1">
-      <w:start w:val="1"/>
-      <w:numFmt w:val="decimal"/>
-      <w:lvlText w:val="%7."/>
-      <w:lvlJc w:val="left"/>
-      <w:pPr>
-        <w:ind w:left="5040" w:hanging="360"/>
-      </w:pPr>
-    </w:lvl>
-    <w:lvl w:ilvl="7" w:tplc="04160019" w:tentative="1">
-      <w:start w:val="1"/>
-      <w:numFmt w:val="lowerLetter"/>
-      <w:lvlText w:val="%8."/>
-      <w:lvlJc w:val="left"/>
-      <w:pPr>
-        <w:ind w:left="5760" w:hanging="360"/>
-      </w:pPr>
-    </w:lvl>
-    <w:lvl w:ilvl="8" w:tplc="0416001B" w:tentative="1">
-      <w:start w:val="1"/>
-      <w:numFmt w:val="lowerRoman"/>
-      <w:lvlText w:val="%9."/>
-      <w:lvlJc w:val="right"/>
-      <w:pPr>
-        <w:ind w:left="6480" w:hanging="180"/>
-      </w:pPr>
-    </w:lvl>
-  </w:abstractNum>
-  <w:abstractNum w:abstractNumId="1" w15:restartNumberingAfterBreak="0">
-    <w:nsid w:val="4343295A"/>
-    <w:multiLevelType w:val="hybridMultilevel"/>
-    <w:tmpl w:val="F77E23A2"/>
-    <w:lvl w:ilvl="0" w:tplc="B55ABD8A">
-      <w:start w:val="2"/>
-      <w:numFmt w:val="decimalZero"/>
-      <w:lvlText w:val="%1"/>
-      <w:lvlJc w:val="left"/>
-      <w:pPr>
-        <w:ind w:left="720" w:hanging="360"/>
-      </w:pPr>
-      <w:rPr>
-        <w:rFonts w:hint="default"/>
-      </w:rPr>
-    </w:lvl>
-    <w:lvl w:ilvl="1" w:tplc="04160019" w:tentative="1">
-      <w:start w:val="1"/>
-      <w:numFmt w:val="lowerLetter"/>
-      <w:lvlText w:val="%2."/>
-      <w:lvlJc w:val="left"/>
-      <w:pPr>
-        <w:ind w:left="1440" w:hanging="360"/>
-      </w:pPr>
-    </w:lvl>
-    <w:lvl w:ilvl="2" w:tplc="0416001B" w:tentative="1">
-      <w:start w:val="1"/>
-      <w:numFmt w:val="lowerRoman"/>
-      <w:lvlText w:val="%3."/>
-      <w:lvlJc w:val="right"/>
-      <w:pPr>
-        <w:ind w:left="2160" w:hanging="180"/>
-      </w:pPr>
-    </w:lvl>
-    <w:lvl w:ilvl="3" w:tplc="0416000F" w:tentative="1">
-      <w:start w:val="1"/>
-      <w:numFmt w:val="decimal"/>
-      <w:lvlText w:val="%4."/>
-      <w:lvlJc w:val="left"/>
-      <w:pPr>
-        <w:ind w:left="2880" w:hanging="360"/>
-      </w:pPr>
-    </w:lvl>
-    <w:lvl w:ilvl="4" w:tplc="04160019" w:tentative="1">
-      <w:start w:val="1"/>
-      <w:numFmt w:val="lowerLetter"/>
-      <w:lvlText w:val="%5."/>
-      <w:lvlJc w:val="left"/>
-      <w:pPr>
-        <w:ind w:left="3600" w:hanging="360"/>
-      </w:pPr>
-    </w:lvl>
-    <w:lvl w:ilvl="5" w:tplc="0416001B" w:tentative="1">
-      <w:start w:val="1"/>
-      <w:numFmt w:val="lowerRoman"/>
-      <w:lvlText w:val="%6."/>
-      <w:lvlJc w:val="right"/>
-      <w:pPr>
-        <w:ind w:left="4320" w:hanging="180"/>
-      </w:pPr>
-    </w:lvl>
-    <w:lvl w:ilvl="6" w:tplc="0416000F" w:tentative="1">
-      <w:start w:val="1"/>
-      <w:numFmt w:val="decimal"/>
-      <w:lvlText w:val="%7."/>
-      <w:lvlJc w:val="left"/>
-      <w:pPr>
-        <w:ind w:left="5040" w:hanging="360"/>
-      </w:pPr>
-    </w:lvl>
-    <w:lvl w:ilvl="7" w:tplc="04160019" w:tentative="1">
-      <w:start w:val="1"/>
-      <w:numFmt w:val="lowerLetter"/>
-      <w:lvlText w:val="%8."/>
-      <w:lvlJc w:val="left"/>
-      <w:pPr>
-        <w:ind w:left="5760" w:hanging="360"/>
-      </w:pPr>
-    </w:lvl>
-    <w:lvl w:ilvl="8" w:tplc="0416001B" w:tentative="1">
-      <w:start w:val="1"/>
-      <w:numFmt w:val="lowerRoman"/>
-      <w:lvlText w:val="%9."/>
-      <w:lvlJc w:val="right"/>
-      <w:pPr>
-        <w:ind w:left="6480" w:hanging="180"/>
-      </w:pPr>
-    </w:lvl>
-  </w:abstractNum>
-  <w:abstractNum w:abstractNumId="2" w15:restartNumberingAfterBreak="0">
-    <w:nsid w:val="45C8B876"/>
-    <w:multiLevelType w:val="hybridMultilevel"/>
-    <w:tmpl w:val="315E73BC"/>
-    <w:lvl w:ilvl="0" w:tplc="7E0ADA2A">
-      <w:start w:val="1"/>
-      <w:numFmt w:val="decimal"/>
-      <w:lvlText w:val="%1-"/>
-      <w:lvlJc w:val="left"/>
-      <w:pPr>
-        <w:ind w:left="720" w:hanging="360"/>
-      </w:pPr>
-    </w:lvl>
-    <w:lvl w:ilvl="1" w:tplc="3444663E">
-      <w:start w:val="1"/>
-      <w:numFmt w:val="lowerLetter"/>
-      <w:lvlText w:val="%2."/>
-      <w:lvlJc w:val="left"/>
-      <w:pPr>
-        <w:ind w:left="1440" w:hanging="360"/>
-      </w:pPr>
-    </w:lvl>
-    <w:lvl w:ilvl="2" w:tplc="B0FA1B14">
-      <w:start w:val="1"/>
-      <w:numFmt w:val="lowerRoman"/>
-      <w:lvlText w:val="%3."/>
-      <w:lvlJc w:val="right"/>
-      <w:pPr>
-        <w:ind w:left="2160" w:hanging="180"/>
-      </w:pPr>
-    </w:lvl>
-    <w:lvl w:ilvl="3" w:tplc="39F4919A">
-      <w:start w:val="1"/>
-      <w:numFmt w:val="decimal"/>
-      <w:lvlText w:val="%4."/>
-      <w:lvlJc w:val="left"/>
-      <w:pPr>
-        <w:ind w:left="2880" w:hanging="360"/>
-      </w:pPr>
-    </w:lvl>
-    <w:lvl w:ilvl="4" w:tplc="620012FE">
-      <w:start w:val="1"/>
-      <w:numFmt w:val="lowerLetter"/>
-      <w:lvlText w:val="%5."/>
-      <w:lvlJc w:val="left"/>
-      <w:pPr>
-        <w:ind w:left="3600" w:hanging="360"/>
-      </w:pPr>
-    </w:lvl>
-    <w:lvl w:ilvl="5" w:tplc="12221E64">
-      <w:start w:val="1"/>
-      <w:numFmt w:val="lowerRoman"/>
-      <w:lvlText w:val="%6."/>
-      <w:lvlJc w:val="right"/>
-      <w:pPr>
-        <w:ind w:left="4320" w:hanging="180"/>
-      </w:pPr>
-    </w:lvl>
-    <w:lvl w:ilvl="6" w:tplc="4F0CF0D8">
-      <w:start w:val="1"/>
-      <w:numFmt w:val="decimal"/>
-      <w:lvlText w:val="%7."/>
-      <w:lvlJc w:val="left"/>
-      <w:pPr>
-        <w:ind w:left="5040" w:hanging="360"/>
-      </w:pPr>
-    </w:lvl>
-    <w:lvl w:ilvl="7" w:tplc="0EE26F4C">
-      <w:start w:val="1"/>
-      <w:numFmt w:val="lowerLetter"/>
-      <w:lvlText w:val="%8."/>
-      <w:lvlJc w:val="left"/>
-      <w:pPr>
-        <w:ind w:left="5760" w:hanging="360"/>
-      </w:pPr>
-    </w:lvl>
-    <w:lvl w:ilvl="8" w:tplc="4DD6787C">
-      <w:start w:val="1"/>
-      <w:numFmt w:val="lowerRoman"/>
-      <w:lvlText w:val="%9."/>
-      <w:lvlJc w:val="right"/>
-      <w:pPr>
-        <w:ind w:left="6480" w:hanging="180"/>
-      </w:pPr>
-    </w:lvl>
-  </w:abstractNum>
-  <w:abstractNum w:abstractNumId="3" w15:restartNumberingAfterBreak="0">
-    <w:nsid w:val="55990E6B"/>
-    <w:multiLevelType w:val="hybridMultilevel"/>
-    <w:tmpl w:val="8584BFE4"/>
-    <w:lvl w:ilvl="0" w:tplc="650E5446">
-      <w:start w:val="1"/>
-      <w:numFmt w:val="decimalZero"/>
-      <w:lvlText w:val="%1-"/>
-      <w:lvlJc w:val="left"/>
-      <w:pPr>
-        <w:ind w:left="720" w:hanging="360"/>
-      </w:pPr>
-      <w:rPr>
-        <w:rFonts w:hint="default"/>
-      </w:rPr>
-    </w:lvl>
-    <w:lvl w:ilvl="1" w:tplc="04160019" w:tentative="1">
-      <w:start w:val="1"/>
-      <w:numFmt w:val="lowerLetter"/>
-      <w:lvlText w:val="%2."/>
-      <w:lvlJc w:val="left"/>
-      <w:pPr>
-        <w:ind w:left="1440" w:hanging="360"/>
-      </w:pPr>
-    </w:lvl>
-    <w:lvl w:ilvl="2" w:tplc="0416001B" w:tentative="1">
-      <w:start w:val="1"/>
-      <w:numFmt w:val="lowerRoman"/>
-      <w:lvlText w:val="%3."/>
-      <w:lvlJc w:val="right"/>
-      <w:pPr>
-        <w:ind w:left="2160" w:hanging="180"/>
-      </w:pPr>
-    </w:lvl>
-    <w:lvl w:ilvl="3" w:tplc="0416000F" w:tentative="1">
-      <w:start w:val="1"/>
-      <w:numFmt w:val="decimal"/>
-      <w:lvlText w:val="%4."/>
-      <w:lvlJc w:val="left"/>
-      <w:pPr>
-        <w:ind w:left="2880" w:hanging="360"/>
-      </w:pPr>
-    </w:lvl>
-    <w:lvl w:ilvl="4" w:tplc="04160019" w:tentative="1">
-      <w:start w:val="1"/>
-      <w:numFmt w:val="lowerLetter"/>
-      <w:lvlText w:val="%5."/>
-      <w:lvlJc w:val="left"/>
-      <w:pPr>
-        <w:ind w:left="3600" w:hanging="360"/>
-      </w:pPr>
-    </w:lvl>
-    <w:lvl w:ilvl="5" w:tplc="0416001B" w:tentative="1">
-      <w:start w:val="1"/>
-      <w:numFmt w:val="lowerRoman"/>
-      <w:lvlText w:val="%6."/>
-      <w:lvlJc w:val="right"/>
-      <w:pPr>
-        <w:ind w:left="4320" w:hanging="180"/>
-      </w:pPr>
-    </w:lvl>
-    <w:lvl w:ilvl="6" w:tplc="0416000F" w:tentative="1">
-      <w:start w:val="1"/>
-      <w:numFmt w:val="decimal"/>
-      <w:lvlText w:val="%7."/>
-      <w:lvlJc w:val="left"/>
-      <w:pPr>
-        <w:ind w:left="5040" w:hanging="360"/>
-      </w:pPr>
-    </w:lvl>
-    <w:lvl w:ilvl="7" w:tplc="04160019" w:tentative="1">
-      <w:start w:val="1"/>
-      <w:numFmt w:val="lowerLetter"/>
-      <w:lvlText w:val="%8."/>
-      <w:lvlJc w:val="left"/>
-      <w:pPr>
-        <w:ind w:left="5760" w:hanging="360"/>
-      </w:pPr>
-    </w:lvl>
-    <w:lvl w:ilvl="8" w:tplc="0416001B" w:tentative="1">
-      <w:start w:val="1"/>
-      <w:numFmt w:val="lowerRoman"/>
-      <w:lvlText w:val="%9."/>
-      <w:lvlJc w:val="right"/>
-      <w:pPr>
-        <w:ind w:left="6480" w:hanging="180"/>
-      </w:pPr>
-    </w:lvl>
-  </w:abstractNum>
-  <w:abstractNum w:abstractNumId="4" w15:restartNumberingAfterBreak="0">
-    <w:nsid w:val="5C2A13BC"/>
-    <w:multiLevelType w:val="hybridMultilevel"/>
-    <w:tmpl w:val="2C5875E8"/>
-    <w:lvl w:ilvl="0" w:tplc="3D2AFBD2">
-      <w:start w:val="2"/>
-      <w:numFmt w:val="decimalZero"/>
-      <w:lvlText w:val="%1"/>
-      <w:lvlJc w:val="left"/>
-      <w:pPr>
-        <w:ind w:left="460" w:hanging="360"/>
-      </w:pPr>
-      <w:rPr>
-        <w:rFonts w:hint="default"/>
-      </w:rPr>
-    </w:lvl>
-    <w:lvl w:ilvl="1" w:tplc="04160019" w:tentative="1">
-      <w:start w:val="1"/>
-      <w:numFmt w:val="lowerLetter"/>
-      <w:lvlText w:val="%2."/>
-      <w:lvlJc w:val="left"/>
-      <w:pPr>
-        <w:ind w:left="1180" w:hanging="360"/>
-      </w:pPr>
-    </w:lvl>
-    <w:lvl w:ilvl="2" w:tplc="0416001B" w:tentative="1">
-      <w:start w:val="1"/>
-      <w:numFmt w:val="lowerRoman"/>
-      <w:lvlText w:val="%3."/>
-      <w:lvlJc w:val="right"/>
-      <w:pPr>
-        <w:ind w:left="1900" w:hanging="180"/>
-      </w:pPr>
-    </w:lvl>
-    <w:lvl w:ilvl="3" w:tplc="0416000F" w:tentative="1">
-      <w:start w:val="1"/>
-      <w:numFmt w:val="decimal"/>
-      <w:lvlText w:val="%4."/>
-      <w:lvlJc w:val="left"/>
-      <w:pPr>
-        <w:ind w:left="2620" w:hanging="360"/>
-      </w:pPr>
-    </w:lvl>
-    <w:lvl w:ilvl="4" w:tplc="04160019" w:tentative="1">
-      <w:start w:val="1"/>
-      <w:numFmt w:val="lowerLetter"/>
-      <w:lvlText w:val="%5."/>
-      <w:lvlJc w:val="left"/>
-      <w:pPr>
-        <w:ind w:left="3340" w:hanging="360"/>
-      </w:pPr>
-    </w:lvl>
-    <w:lvl w:ilvl="5" w:tplc="0416001B" w:tentative="1">
-      <w:start w:val="1"/>
-      <w:numFmt w:val="lowerRoman"/>
-      <w:lvlText w:val="%6."/>
-      <w:lvlJc w:val="right"/>
-      <w:pPr>
-        <w:ind w:left="4060" w:hanging="180"/>
-      </w:pPr>
-    </w:lvl>
-    <w:lvl w:ilvl="6" w:tplc="0416000F" w:tentative="1">
-      <w:start w:val="1"/>
-      <w:numFmt w:val="decimal"/>
-      <w:lvlText w:val="%7."/>
-      <w:lvlJc w:val="left"/>
-      <w:pPr>
-        <w:ind w:left="4780" w:hanging="360"/>
-      </w:pPr>
-    </w:lvl>
-    <w:lvl w:ilvl="7" w:tplc="04160019" w:tentative="1">
-      <w:start w:val="1"/>
-      <w:numFmt w:val="lowerLetter"/>
-      <w:lvlText w:val="%8."/>
-      <w:lvlJc w:val="left"/>
-      <w:pPr>
-        <w:ind w:left="5500" w:hanging="360"/>
-      </w:pPr>
-    </w:lvl>
-    <w:lvl w:ilvl="8" w:tplc="0416001B" w:tentative="1">
-      <w:start w:val="1"/>
-      <w:numFmt w:val="lowerRoman"/>
-      <w:lvlText w:val="%9."/>
-      <w:lvlJc w:val="right"/>
-      <w:pPr>
-        <w:ind w:left="6220" w:hanging="180"/>
-      </w:pPr>
-    </w:lvl>
-  </w:abstractNum>
-  <w:abstractNum w:abstractNumId="5" w15:restartNumberingAfterBreak="0">
-    <w:nsid w:val="6527659A"/>
-    <w:multiLevelType w:val="hybridMultilevel"/>
-    <w:tmpl w:val="3BFEF4EC"/>
-    <w:lvl w:ilvl="0" w:tplc="F820698A">
-      <w:start w:val="2"/>
-      <w:numFmt w:val="decimalZero"/>
-      <w:lvlText w:val="%1-"/>
-      <w:lvlJc w:val="left"/>
-      <w:pPr>
-        <w:ind w:left="820" w:hanging="360"/>
-      </w:pPr>
-      <w:rPr>
-        <w:rFonts w:hint="default"/>
-      </w:rPr>
-    </w:lvl>
-    <w:lvl w:ilvl="1" w:tplc="04160019" w:tentative="1">
-      <w:start w:val="1"/>
-      <w:numFmt w:val="lowerLetter"/>
-      <w:lvlText w:val="%2."/>
-      <w:lvlJc w:val="left"/>
-      <w:pPr>
-        <w:ind w:left="1540" w:hanging="360"/>
-      </w:pPr>
-    </w:lvl>
-    <w:lvl w:ilvl="2" w:tplc="0416001B" w:tentative="1">
-      <w:start w:val="1"/>
-      <w:numFmt w:val="lowerRoman"/>
-      <w:lvlText w:val="%3."/>
-      <w:lvlJc w:val="right"/>
-      <w:pPr>
-        <w:ind w:left="2260" w:hanging="180"/>
-      </w:pPr>
-    </w:lvl>
-    <w:lvl w:ilvl="3" w:tplc="0416000F" w:tentative="1">
-      <w:start w:val="1"/>
-      <w:numFmt w:val="decimal"/>
-      <w:lvlText w:val="%4."/>
-      <w:lvlJc w:val="left"/>
-      <w:pPr>
-        <w:ind w:left="2980" w:hanging="360"/>
-      </w:pPr>
-    </w:lvl>
-    <w:lvl w:ilvl="4" w:tplc="04160019" w:tentative="1">
-      <w:start w:val="1"/>
-      <w:numFmt w:val="lowerLetter"/>
-      <w:lvlText w:val="%5."/>
-      <w:lvlJc w:val="left"/>
-      <w:pPr>
-        <w:ind w:left="3700" w:hanging="360"/>
-      </w:pPr>
-    </w:lvl>
-    <w:lvl w:ilvl="5" w:tplc="0416001B" w:tentative="1">
-      <w:start w:val="1"/>
-      <w:numFmt w:val="lowerRoman"/>
-      <w:lvlText w:val="%6."/>
-      <w:lvlJc w:val="right"/>
-      <w:pPr>
-        <w:ind w:left="4420" w:hanging="180"/>
-      </w:pPr>
-    </w:lvl>
-    <w:lvl w:ilvl="6" w:tplc="0416000F" w:tentative="1">
-      <w:start w:val="1"/>
-      <w:numFmt w:val="decimal"/>
-      <w:lvlText w:val="%7."/>
-      <w:lvlJc w:val="left"/>
-      <w:pPr>
-        <w:ind w:left="5140" w:hanging="360"/>
-      </w:pPr>
-    </w:lvl>
-    <w:lvl w:ilvl="7" w:tplc="04160019" w:tentative="1">
-      <w:start w:val="1"/>
-      <w:numFmt w:val="lowerLetter"/>
-      <w:lvlText w:val="%8."/>
-      <w:lvlJc w:val="left"/>
-      <w:pPr>
-        <w:ind w:left="5860" w:hanging="360"/>
-      </w:pPr>
-    </w:lvl>
-    <w:lvl w:ilvl="8" w:tplc="0416001B" w:tentative="1">
-      <w:start w:val="1"/>
-      <w:numFmt w:val="lowerRoman"/>
-      <w:lvlText w:val="%9."/>
-      <w:lvlJc w:val="right"/>
-      <w:pPr>
-        <w:ind w:left="6580" w:hanging="180"/>
-      </w:pPr>
-    </w:lvl>
-  </w:abstractNum>
-  <w:num w:numId="1">
-    <w:abstractNumId w:val="3"/>
-  </w:num>
-  <w:num w:numId="2">
-    <w:abstractNumId w:val="1"/>
-  </w:num>
-  <w:num w:numId="3">
-    <w:abstractNumId w:val="4"/>
-  </w:num>
-  <w:num w:numId="4">
-    <w:abstractNumId w:val="5"/>
-  </w:num>
-  <w:num w:numId="5">
-    <w:abstractNumId w:val="2"/>
-  </w:num>
-  <w:num w:numId="6">
-    <w:abstractNumId w:val="0"/>
-  </w:num>
-</w:numbering>
-</file>
-
 <file path=word/styles.xml><?xml version="1.0" encoding="utf-8"?>
-<w:styles xmlns:mc="http://schemas.openxmlformats.org/markup-compatibility/2006" xmlns:r="http://schemas.openxmlformats.org/officeDocument/2006/relationships" xmlns:w="http://schemas.openxmlformats.org/wordprocessingml/2006/main" xmlns:w14="http://schemas.microsoft.com/office/word/2010/wordml" xmlns:w15="http://schemas.microsoft.com/office/word/2012/wordml" xmlns:w16cid="http://schemas.microsoft.com/office/word/2016/wordml/cid" xmlns:w16se="http://schemas.microsoft.com/office/word/2015/wordml/symex" mc:Ignorable="w14 w15 w16se w16cid">
+<w:styles xmlns:mc="http://schemas.openxmlformats.org/markup-compatibility/2006" xmlns:r="http://schemas.openxmlformats.org/officeDocument/2006/relationships" xmlns:w="http://schemas.openxmlformats.org/wordprocessingml/2006/main" xmlns:w14="http://schemas.microsoft.com/office/word/2010/wordml" xmlns:w15="http://schemas.microsoft.com/office/word/2012/wordml" xmlns:w16cex="http://schemas.microsoft.com/office/word/2018/wordml/cex" xmlns:w16cid="http://schemas.microsoft.com/office/word/2016/wordml/cid" xmlns:w16="http://schemas.microsoft.com/office/word/2018/wordml" xmlns:w16du="http://schemas.microsoft.com/office/word/2023/wordml/word16du" xmlns:w16sdtdh="http://schemas.microsoft.com/office/word/2020/wordml/sdtdatahash" xmlns:w16sdtfl="http://schemas.microsoft.com/office/word/2024/wordml/sdtformatlock" xmlns:w16se="http://schemas.microsoft.com/office/word/2015/wordml/symex" mc:Ignorable="w14 w15 w16se w16cid w16 w16cex w16sdtdh w16sdtfl w16du">
   <w:docDefaults>
     <w:rPrDefault>
       <w:rPr>
@@ -2012,7 +1036,7 @@
       </w:pPr>
     </w:pPrDefault>
   </w:docDefaults>
-  <w:latentStyles w:defLockedState="0" w:defUIPriority="99" w:defSemiHidden="0" w:defUnhideWhenUsed="0" w:defQFormat="0" w:count="375">
+  <w:latentStyles w:defLockedState="0" w:defUIPriority="99" w:defSemiHidden="0" w:defUnhideWhenUsed="0" w:defQFormat="0" w:count="376">
     <w:lsdException w:name="Normal" w:uiPriority="0" w:qFormat="1"/>
     <w:lsdException w:name="heading 1" w:uiPriority="9" w:qFormat="1"/>
     <w:lsdException w:name="heading 2" w:semiHidden="1" w:uiPriority="9" w:unhideWhenUsed="1" w:qFormat="1"/>
@@ -2388,6 +1412,7 @@
     <w:lsdException w:name="Smart Hyperlink" w:semiHidden="1" w:unhideWhenUsed="1"/>
     <w:lsdException w:name="Hashtag" w:semiHidden="1" w:unhideWhenUsed="1"/>
     <w:lsdException w:name="Unresolved Mention" w:semiHidden="1" w:unhideWhenUsed="1"/>
+    <w:lsdException w:name="Smart Link" w:semiHidden="1" w:unhideWhenUsed="1"/>
   </w:latentStyles>
   <w:style w:type="paragraph" w:default="1" w:styleId="Normal">
     <w:name w:val="Normal"/>

</xml_diff>